<commit_message>
Hard Stop 4 evidence review with the student's verbatim code-review record
Co-Authored-By: Claude Sonnet 5.5 <noreply@anthropic.com>
</commit_message>
<xml_diff>
--- a/docs/CISC699_HardStop4_TechnicalEvidenceReview.docx
+++ b/docs/CISC699_HardStop4_TechnicalEvidenceReview.docx
@@ -759,7 +759,7 @@
                 <w:sz w:val="17"/>
                 <w:szCs w:val="17"/>
               </w:rPr>
-              <w:t xml:space="preserve">The student read the eight set-2 annotations and replied "approve all" (recorded in docs/evidence/sprint-4/annotation-approval.txt); no change was requested. The student was not told the number or cost of the 32 live Bedrock calls (about $0.20) before they were made; the AI ran them under the student's general "go" and reported them afterwards. The student had not yet done the code review in docs/STUDENT_REVIEW_GUIDE.md when this entry was written.</w:t>
+              <w:t xml:space="preserve">The student read the eight set-2 annotations and replied "approve all" (recorded in docs/evidence/sprint-4/annotation-approval.txt); no change was requested. The student was not told the number or cost of the 32 live Bedrock calls (about $0.20) before they were made; the AI ran them under the student's general "go" and reported them afterwards. The student then reviewed five highest-risk areas in a chat session, item by item, with replies recorded verbatim in docs/evidence/sprint-4/student-review-record.md: items 1 to 4 (scoring function, weight blend and fallback, classifier path, harness tie rule) were answered in detail and led to decisions and issues KI-23 and KI-24; item 5 (the ablation and five AHP judgments) was answered with a general approval only.</w:t>
             </w:r>
           </w:p>
         </w:tc>
@@ -1316,7 +1316,7 @@
                 <w:sz w:val="17"/>
                 <w:szCs w:val="17"/>
               </w:rPr>
-              <w:t xml:space="preserve">To be recorded by the student. Any edits made after this entry was written are not reflected here.</w:t>
+              <w:t xml:space="preserve">The student-review section contains the student's replies exactly as typed. The student set the decisions listed in Section 1.4 of the document. Any other edits the student makes after this entry was written are not reflected here.</w:t>
             </w:r>
           </w:p>
         </w:tc>
@@ -1891,7 +1891,7 @@
                 <w:sz w:val="16"/>
                 <w:szCs w:val="16"/>
               </w:rPr>
-              <w:t xml:space="preserve">AHP judgments (from Hard Stop 3)</w:t>
+              <w:t xml:space="preserve">Student-led code review (Section 1.3)</w:t>
             </w:r>
           </w:p>
         </w:tc>
@@ -1917,7 +1917,7 @@
                 <w:sz w:val="16"/>
                 <w:szCs w:val="16"/>
               </w:rPr>
-              <w:t xml:space="preserve">AI proposed, student adopted</w:t>
+              <w:t xml:space="preserve">Student (replies verbatim)</w:t>
             </w:r>
           </w:p>
         </w:tc>
@@ -1943,7 +1943,91 @@
                 <w:sz w:val="16"/>
                 <w:szCs w:val="16"/>
               </w:rPr>
-              <w:t xml:space="preserve">Unchanged since Hard Stop 3</w:t>
+              <w:t xml:space="preserve">Items 1 to 4 answered in detail and led to decisions and issues; item 5 (ablation and five AHP pairs) was answered "item 5 looks good to me" with no pair-by-pair justification</w:t>
+            </w:r>
+          </w:p>
+        </w:tc>
+      </w:tr>
+      <w:tr>
+        <w:trPr>
+          <w:cantSplit/>
+          <w:tblHeader w:val="off"/>
+        </w:trPr>
+        <w:tc>
+          <w:tcPr>
+            <w:tcW w:type="dxa" w:w="3600"/>
+            <w:tcMar>
+              <w:top w:type="dxa" w:w="45"/>
+              <w:left w:type="dxa" w:w="85"/>
+              <w:bottom w:type="dxa" w:w="45"/>
+              <w:right w:type="dxa" w:w="85"/>
+            </w:tcMar>
+          </w:tcPr>
+          <w:p>
+            <w:pPr>
+              <w:spacing w:after="20"/>
+            </w:pPr>
+            <w:r>
+              <w:rPr>
+                <w:rFonts w:ascii="Calibri" w:cs="Calibri" w:eastAsia="Calibri" w:hAnsi="Calibri"/>
+                <w:b w:val="false"/>
+                <w:bCs w:val="false"/>
+                <w:sz w:val="16"/>
+                <w:szCs w:val="16"/>
+              </w:rPr>
+              <w:t xml:space="preserve">AHP judgments (from Hard Stop 3)</w:t>
+            </w:r>
+          </w:p>
+        </w:tc>
+        <w:tc>
+          <w:tcPr>
+            <w:tcW w:type="dxa" w:w="2400"/>
+            <w:tcMar>
+              <w:top w:type="dxa" w:w="45"/>
+              <w:left w:type="dxa" w:w="85"/>
+              <w:bottom w:type="dxa" w:w="45"/>
+              <w:right w:type="dxa" w:w="85"/>
+            </w:tcMar>
+          </w:tcPr>
+          <w:p>
+            <w:pPr>
+              <w:spacing w:after="20"/>
+            </w:pPr>
+            <w:r>
+              <w:rPr>
+                <w:rFonts w:ascii="Calibri" w:cs="Calibri" w:eastAsia="Calibri" w:hAnsi="Calibri"/>
+                <w:b w:val="false"/>
+                <w:bCs w:val="false"/>
+                <w:sz w:val="16"/>
+                <w:szCs w:val="16"/>
+              </w:rPr>
+              <w:t xml:space="preserve">AI proposed, student adopted</w:t>
+            </w:r>
+          </w:p>
+        </w:tc>
+        <w:tc>
+          <w:tcPr>
+            <w:tcW w:type="dxa" w:w="3720"/>
+            <w:tcMar>
+              <w:top w:type="dxa" w:w="45"/>
+              <w:left w:type="dxa" w:w="85"/>
+              <w:bottom w:type="dxa" w:w="45"/>
+              <w:right w:type="dxa" w:w="85"/>
+            </w:tcMar>
+          </w:tcPr>
+          <w:p>
+            <w:pPr>
+              <w:spacing w:after="20"/>
+            </w:pPr>
+            <w:r>
+              <w:rPr>
+                <w:rFonts w:ascii="Calibri" w:cs="Calibri" w:eastAsia="Calibri" w:hAnsi="Calibri"/>
+                <w:b w:val="false"/>
+                <w:bCs w:val="false"/>
+                <w:sz w:val="16"/>
+                <w:szCs w:val="16"/>
+              </w:rPr>
+              <w:t xml:space="preserve">Unchanged since Hard Stop 3; the five weakest pairs were not individually reviewed</w:t>
             </w:r>
           </w:p>
         </w:tc>
@@ -2123,6 +2207,35 @@
         <w:t xml:space="preserve">1.3 Student-led review record</w:t>
       </w:r>
     </w:p>
+    <w:p>
+      <w:pPr>
+        <w:spacing w:after="110" w:before="70" w:line="262"/>
+      </w:pPr>
+      <w:r>
+        <w:rPr>
+          <w:rFonts w:ascii="Calibri" w:cs="Calibri" w:eastAsia="Calibri" w:hAnsi="Calibri"/>
+          <w:sz w:val="21"/>
+          <w:szCs w:val="21"/>
+        </w:rPr>
+        <w:t xml:space="preserve">The student reviewed the highest-risk code in a chat session on 2026-10-25, one item at a time. For each item the AI showed a short piece of code and asked questions; the student answered in their own words. The student's replies below are copied exactly as typed (including questions they asked back). Notes in italics are the AI's clarifications, not the student's. The full record is docs/evidence/sprint-4/student-review-record.md.</w:t>
+      </w:r>
+    </w:p>
+    <w:p>
+      <w:pPr>
+        <w:keepNext/>
+        <w:spacing w:after="50" w:before="140"/>
+      </w:pPr>
+      <w:r>
+        <w:rPr>
+          <w:rFonts w:ascii="Calibri" w:cs="Calibri" w:eastAsia="Calibri" w:hAnsi="Calibri"/>
+          <w:b/>
+          <w:bCs/>
+          <w:sz w:val="22"/>
+          <w:szCs w:val="22"/>
+        </w:rPr>
+        <w:t xml:space="preserve">Item 1: scoring function (`lambda/shared/match.ts`, `computeMatchScore`)</w:t>
+      </w:r>
+    </w:p>
     <w:tbl>
       <w:tblPr>
         <w:tblW w:type="dxa" w:w="9720"/>
@@ -2136,7 +2249,8 @@
         </w:tblBorders>
       </w:tblPr>
       <w:tblGrid>
-        <w:gridCol w:w="9720"/>
+        <w:gridCol w:w="3700"/>
+        <w:gridCol w:w="6020"/>
       </w:tblGrid>
       <w:tr>
         <w:trPr>
@@ -2145,33 +2259,249 @@
         </w:trPr>
         <w:tc>
           <w:tcPr>
-            <w:tcW w:type="dxa" w:w="9720"/>
-            <w:shd w:fill="FBE0DD" w:val="clear"/>
-            <w:tcMar>
-              <w:top w:type="dxa" w:w="45"/>
-              <w:left w:type="dxa" w:w="85"/>
-              <w:bottom w:type="dxa" w:w="45"/>
-              <w:right w:type="dxa" w:w="85"/>
-            </w:tcMar>
-          </w:tcPr>
-          <w:p>
-            <w:pPr>
-              <w:spacing w:after="20"/>
-            </w:pPr>
-            <w:r>
-              <w:rPr>
-                <w:rFonts w:ascii="Calibri" w:cs="Calibri" w:eastAsia="Calibri" w:hAnsi="Calibri"/>
-                <w:b/>
-                <w:bCs/>
-                <w:sz w:val="18"/>
-                <w:szCs w:val="18"/>
-              </w:rPr>
-              <w:t xml:space="preserve">TO BE COMPLETED BY THE STUDENT BEFORE SUBMITTING. This section must contain the student's own words about what they read and what they challenged, following docs/STUDENT_REVIEW_GUIDE.md (scoring function, weight blend and fallback, classifier path, evaluation harness, ablation, five AHP judgments). It is deliberately left unfilled here: the AI cannot write the student's review. If this box is still here when the document is submitted, the review has not been done and the AI-integrity criterion should be read accordingly.</w:t>
+            <w:tcW w:type="dxa" w:w="3700"/>
+            <w:shd w:fill="E8F3EF" w:val="clear"/>
+            <w:tcMar>
+              <w:top w:type="dxa" w:w="45"/>
+              <w:left w:type="dxa" w:w="85"/>
+              <w:bottom w:type="dxa" w:w="45"/>
+              <w:right w:type="dxa" w:w="85"/>
+            </w:tcMar>
+          </w:tcPr>
+          <w:p>
+            <w:pPr>
+              <w:spacing w:after="20"/>
+            </w:pPr>
+            <w:r>
+              <w:rPr>
+                <w:rFonts w:ascii="Calibri" w:cs="Calibri" w:eastAsia="Calibri" w:hAnsi="Calibri"/>
+                <w:b/>
+                <w:bCs/>
+                <w:sz w:val="16"/>
+                <w:szCs w:val="16"/>
+              </w:rPr>
+              <w:t xml:space="preserve">Question the AI asked</w:t>
+            </w:r>
+          </w:p>
+        </w:tc>
+        <w:tc>
+          <w:tcPr>
+            <w:tcW w:type="dxa" w:w="6020"/>
+            <w:shd w:fill="E8F3EF" w:val="clear"/>
+            <w:tcMar>
+              <w:top w:type="dxa" w:w="45"/>
+              <w:left w:type="dxa" w:w="85"/>
+              <w:bottom w:type="dxa" w:w="45"/>
+              <w:right w:type="dxa" w:w="85"/>
+            </w:tcMar>
+          </w:tcPr>
+          <w:p>
+            <w:pPr>
+              <w:spacing w:after="20"/>
+            </w:pPr>
+            <w:r>
+              <w:rPr>
+                <w:rFonts w:ascii="Calibri" w:cs="Calibri" w:eastAsia="Calibri" w:hAnsi="Calibri"/>
+                <w:b/>
+                <w:bCs/>
+                <w:sz w:val="16"/>
+                <w:szCs w:val="16"/>
+              </w:rPr>
+              <w:t xml:space="preserve">The student's reply (verbatim)</w:t>
+            </w:r>
+          </w:p>
+        </w:tc>
+      </w:tr>
+      <w:tr>
+        <w:trPr>
+          <w:cantSplit/>
+          <w:tblHeader w:val="off"/>
+        </w:trPr>
+        <w:tc>
+          <w:tcPr>
+            <w:tcW w:type="dxa" w:w="3700"/>
+            <w:tcMar>
+              <w:top w:type="dxa" w:w="45"/>
+              <w:left w:type="dxa" w:w="85"/>
+              <w:bottom w:type="dxa" w:w="45"/>
+              <w:right w:type="dxa" w:w="85"/>
+            </w:tcMar>
+          </w:tcPr>
+          <w:p>
+            <w:pPr>
+              <w:spacing w:after="20"/>
+            </w:pPr>
+            <w:r>
+              <w:rPr>
+                <w:rFonts w:ascii="Calibri" w:cs="Calibri" w:eastAsia="Calibri" w:hAnsi="Calibri"/>
+                <w:b w:val="false"/>
+                <w:bCs w:val="false"/>
+                <w:sz w:val="16"/>
+                <w:szCs w:val="16"/>
+              </w:rPr>
+              <w:t xml:space="preserve">Open slots count twice (inside pickup urgency and again as long-term care). Does that make sense? What would you change?</w:t>
+            </w:r>
+          </w:p>
+        </w:tc>
+        <w:tc>
+          <w:tcPr>
+            <w:tcW w:type="dxa" w:w="6020"/>
+            <w:tcMar>
+              <w:top w:type="dxa" w:w="45"/>
+              <w:left w:type="dxa" w:w="85"/>
+              <w:bottom w:type="dxa" w:w="45"/>
+              <w:right w:type="dxa" w:w="85"/>
+            </w:tcMar>
+          </w:tcPr>
+          <w:p>
+            <w:pPr>
+              <w:spacing w:after="20"/>
+            </w:pPr>
+            <w:r>
+              <w:rPr>
+                <w:rFonts w:ascii="Calibri" w:cs="Calibri" w:eastAsia="Calibri" w:hAnsi="Calibri"/>
+                <w:b w:val="false"/>
+                <w:bCs w:val="false"/>
+                <w:sz w:val="16"/>
+                <w:szCs w:val="16"/>
+              </w:rPr>
+              <w:t xml:space="preserve">"lets count it once so it's not skewed"</w:t>
+            </w:r>
+          </w:p>
+        </w:tc>
+      </w:tr>
+      <w:tr>
+        <w:trPr>
+          <w:cantSplit/>
+          <w:tblHeader w:val="off"/>
+        </w:trPr>
+        <w:tc>
+          <w:tcPr>
+            <w:tcW w:type="dxa" w:w="3700"/>
+            <w:tcMar>
+              <w:top w:type="dxa" w:w="45"/>
+              <w:left w:type="dxa" w:w="85"/>
+              <w:bottom w:type="dxa" w:w="45"/>
+              <w:right w:type="dxa" w:w="85"/>
+            </w:tcMar>
+          </w:tcPr>
+          <w:p>
+            <w:pPr>
+              <w:spacing w:after="20"/>
+            </w:pPr>
+            <w:r>
+              <w:rPr>
+                <w:rFonts w:ascii="Calibri" w:cs="Calibri" w:eastAsia="Calibri" w:hAnsi="Calibri"/>
+                <w:b w:val="false"/>
+                <w:bCs w:val="false"/>
+                <w:sz w:val="16"/>
+                <w:szCs w:val="16"/>
+              </w:rPr>
+              <w:t xml:space="preserve">The result is multiplied by confidence and a freshness factor (STATIC = 0.55). Reasonable, or can it override the weights?</w:t>
+            </w:r>
+          </w:p>
+        </w:tc>
+        <w:tc>
+          <w:tcPr>
+            <w:tcW w:type="dxa" w:w="6020"/>
+            <w:tcMar>
+              <w:top w:type="dxa" w:w="45"/>
+              <w:left w:type="dxa" w:w="85"/>
+              <w:bottom w:type="dxa" w:w="45"/>
+              <w:right w:type="dxa" w:w="85"/>
+            </w:tcMar>
+          </w:tcPr>
+          <w:p>
+            <w:pPr>
+              <w:spacing w:after="20"/>
+            </w:pPr>
+            <w:r>
+              <w:rPr>
+                <w:rFonts w:ascii="Calibri" w:cs="Calibri" w:eastAsia="Calibri" w:hAnsi="Calibri"/>
+                <w:b w:val="false"/>
+                <w:bCs w:val="false"/>
+                <w:sz w:val="16"/>
+                <w:szCs w:val="16"/>
+              </w:rPr>
+              <w:t xml:space="preserve">(asked back as a question) "whats a confidence score for a shelter where do we get it from?"</w:t>
+            </w:r>
+          </w:p>
+        </w:tc>
+      </w:tr>
+      <w:tr>
+        <w:trPr>
+          <w:cantSplit/>
+          <w:tblHeader w:val="off"/>
+        </w:trPr>
+        <w:tc>
+          <w:tcPr>
+            <w:tcW w:type="dxa" w:w="3700"/>
+            <w:tcMar>
+              <w:top w:type="dxa" w:w="45"/>
+              <w:left w:type="dxa" w:w="85"/>
+              <w:bottom w:type="dxa" w:w="45"/>
+              <w:right w:type="dxa" w:w="85"/>
+            </w:tcMar>
+          </w:tcPr>
+          <w:p>
+            <w:pPr>
+              <w:spacing w:after="20"/>
+            </w:pPr>
+            <w:r>
+              <w:rPr>
+                <w:rFonts w:ascii="Calibri" w:cs="Calibri" w:eastAsia="Calibri" w:hAnsi="Calibri"/>
+                <w:b w:val="false"/>
+                <w:bCs w:val="false"/>
+                <w:sz w:val="16"/>
+                <w:szCs w:val="16"/>
+              </w:rPr>
+              <w:t xml:space="preserve">A shelter that can only arrange a vet scores 0.6 against 1.0 for one with a vet on site. Defensible for an injured animal?</w:t>
+            </w:r>
+          </w:p>
+        </w:tc>
+        <w:tc>
+          <w:tcPr>
+            <w:tcW w:type="dxa" w:w="6020"/>
+            <w:tcMar>
+              <w:top w:type="dxa" w:w="45"/>
+              <w:left w:type="dxa" w:w="85"/>
+              <w:bottom w:type="dxa" w:w="45"/>
+              <w:right w:type="dxa" w:w="85"/>
+            </w:tcMar>
+          </w:tcPr>
+          <w:p>
+            <w:pPr>
+              <w:spacing w:after="20"/>
+            </w:pPr>
+            <w:r>
+              <w:rPr>
+                <w:rFonts w:ascii="Calibri" w:cs="Calibri" w:eastAsia="Calibri" w:hAnsi="Calibri"/>
+                <w:b w:val="false"/>
+                <w:bCs w:val="false"/>
+                <w:sz w:val="16"/>
+                <w:szCs w:val="16"/>
+              </w:rPr>
+              <w:t xml:space="preserve">(asked back as a question) "shouldn't other factors like injuries dictate this? are we using static weights and not having the agent "smartly" manage them?"</w:t>
             </w:r>
           </w:p>
         </w:tc>
       </w:tr>
     </w:tbl>
+    <w:p>
+      <w:pPr>
+        <w:spacing w:after="110" w:before="70" w:line="262"/>
+      </w:pPr>
+      <w:r>
+        <w:rPr>
+          <w:rFonts w:ascii="Calibri" w:cs="Calibri" w:eastAsia="Calibri" w:hAnsi="Calibri"/>
+          <w:i/>
+          <w:iCs/>
+          <w:sz w:val="18"/>
+          <w:szCs w:val="18"/>
+        </w:rPr>
+        <w:t xml:space="preserve">AI (not the student): the tier-1 `confidence` and `estimatedIntakeWindowMinutes` come from a Bedrock call whose prompt gives the shelter's live facts (slots, vet, species, distance/radius) and the case's needs profile and summary, and shows an example reply of 0.92 and 20; there is no knowledge base, no shelter history, no definition of "confidence", no calibration, and no temperature set. Tier-2 (Slack) shelters use a fixed 0.78 and 45 minutes. Freshness is LIVE for tier 1 and HUMAN for tier 2; SYNCED and STATIC are never assigned in the code. The net effect is that Slack shelters start roughly 25 to 30 percent behind.</w:t>
+      </w:r>
+    </w:p>
     <w:tbl>
       <w:tblPr>
         <w:tblW w:type="dxa" w:w="9720"/>
@@ -2185,10 +2515,8 @@
         </w:tblBorders>
       </w:tblPr>
       <w:tblGrid>
-        <w:gridCol w:w="2000"/>
-        <w:gridCol w:w="2700"/>
-        <w:gridCol w:w="3220"/>
-        <w:gridCol w:w="1800"/>
+        <w:gridCol w:w="3700"/>
+        <w:gridCol w:w="6020"/>
       </w:tblGrid>
       <w:tr>
         <w:trPr>
@@ -2197,7 +2525,7 @@
         </w:trPr>
         <w:tc>
           <w:tcPr>
-            <w:tcW w:type="dxa" w:w="2000"/>
+            <w:tcW w:type="dxa" w:w="3700"/>
             <w:shd w:fill="E8F3EF" w:val="clear"/>
             <w:tcMar>
               <w:top w:type="dxa" w:w="45"/>
@@ -2215,16 +2543,16 @@
                 <w:rFonts w:ascii="Calibri" w:cs="Calibri" w:eastAsia="Calibri" w:hAnsi="Calibri"/>
                 <w:b/>
                 <w:bCs/>
-                <w:sz w:val="17"/>
-                <w:szCs w:val="17"/>
-              </w:rPr>
-              <w:t xml:space="preserve">File / item</w:t>
-            </w:r>
-          </w:p>
-        </w:tc>
-        <w:tc>
-          <w:tcPr>
-            <w:tcW w:type="dxa" w:w="2700"/>
+                <w:sz w:val="16"/>
+                <w:szCs w:val="16"/>
+              </w:rPr>
+              <w:t xml:space="preserve">Student, on</w:t>
+            </w:r>
+          </w:p>
+        </w:tc>
+        <w:tc>
+          <w:tcPr>
+            <w:tcW w:type="dxa" w:w="6020"/>
             <w:shd w:fill="E8F3EF" w:val="clear"/>
             <w:tcMar>
               <w:top w:type="dxa" w:w="45"/>
@@ -2242,16 +2570,186 @@
                 <w:rFonts w:ascii="Calibri" w:cs="Calibri" w:eastAsia="Calibri" w:hAnsi="Calibri"/>
                 <w:b/>
                 <w:bCs/>
-                <w:sz w:val="17"/>
-                <w:szCs w:val="17"/>
-              </w:rPr>
-              <w:t xml:space="preserve">What I checked</w:t>
-            </w:r>
-          </w:p>
-        </w:tc>
-        <w:tc>
-          <w:tcPr>
-            <w:tcW w:type="dxa" w:w="3220"/>
+                <w:sz w:val="16"/>
+                <w:szCs w:val="16"/>
+              </w:rPr>
+              <w:t xml:space="preserve">Reply (verbatim)</w:t>
+            </w:r>
+          </w:p>
+        </w:tc>
+      </w:tr>
+      <w:tr>
+        <w:trPr>
+          <w:cantSplit/>
+          <w:tblHeader w:val="off"/>
+        </w:trPr>
+        <w:tc>
+          <w:tcPr>
+            <w:tcW w:type="dxa" w:w="3700"/>
+            <w:tcMar>
+              <w:top w:type="dxa" w:w="45"/>
+              <w:left w:type="dxa" w:w="85"/>
+              <w:bottom w:type="dxa" w:w="45"/>
+              <w:right w:type="dxa" w:w="85"/>
+            </w:tcMar>
+          </w:tcPr>
+          <w:p>
+            <w:pPr>
+              <w:spacing w:after="20"/>
+            </w:pPr>
+            <w:r>
+              <w:rPr>
+                <w:rFonts w:ascii="Calibri" w:cs="Calibri" w:eastAsia="Calibri" w:hAnsi="Calibri"/>
+                <w:b w:val="false"/>
+                <w:bCs w:val="false"/>
+                <w:sz w:val="16"/>
+                <w:szCs w:val="16"/>
+              </w:rPr>
+              <w:t xml:space="preserve">whether the confidence number is acceptable</w:t>
+            </w:r>
+          </w:p>
+        </w:tc>
+        <w:tc>
+          <w:tcPr>
+            <w:tcW w:type="dxa" w:w="6020"/>
+            <w:tcMar>
+              <w:top w:type="dxa" w:w="45"/>
+              <w:left w:type="dxa" w:w="85"/>
+              <w:bottom w:type="dxa" w:w="45"/>
+              <w:right w:type="dxa" w:w="85"/>
+            </w:tcMar>
+          </w:tcPr>
+          <w:p>
+            <w:pPr>
+              <w:spacing w:after="20"/>
+            </w:pPr>
+            <w:r>
+              <w:rPr>
+                <w:rFonts w:ascii="Calibri" w:cs="Calibri" w:eastAsia="Calibri" w:hAnsi="Calibri"/>
+                <w:b w:val="false"/>
+                <w:bCs w:val="false"/>
+                <w:sz w:val="16"/>
+                <w:szCs w:val="16"/>
+              </w:rPr>
+              <w:t xml:space="preserve">"what's a guess here? is it an informed decision the agent makes against a knowledge base or a prompt we set up? if yes then that works, if it's a random guess then no. slack starting 30% behind is ok"</w:t>
+            </w:r>
+          </w:p>
+        </w:tc>
+      </w:tr>
+      <w:tr>
+        <w:trPr>
+          <w:cantSplit/>
+          <w:tblHeader w:val="off"/>
+        </w:trPr>
+        <w:tc>
+          <w:tcPr>
+            <w:tcW w:type="dxa" w:w="3700"/>
+            <w:tcMar>
+              <w:top w:type="dxa" w:w="45"/>
+              <w:left w:type="dxa" w:w="85"/>
+              <w:bottom w:type="dxa" w:w="45"/>
+              <w:right w:type="dxa" w:w="85"/>
+            </w:tcMar>
+          </w:tcPr>
+          <w:p>
+            <w:pPr>
+              <w:spacing w:after="20"/>
+            </w:pPr>
+            <w:r>
+              <w:rPr>
+                <w:rFonts w:ascii="Calibri" w:cs="Calibri" w:eastAsia="Calibri" w:hAnsi="Calibri"/>
+                <w:b w:val="false"/>
+                <w:bCs w:val="false"/>
+                <w:sz w:val="16"/>
+                <w:szCs w:val="16"/>
+              </w:rPr>
+              <w:t xml:space="preserve">the fixed constants versus agent-generated weights</w:t>
+            </w:r>
+          </w:p>
+        </w:tc>
+        <w:tc>
+          <w:tcPr>
+            <w:tcW w:type="dxa" w:w="6020"/>
+            <w:tcMar>
+              <w:top w:type="dxa" w:w="45"/>
+              <w:left w:type="dxa" w:w="85"/>
+              <w:bottom w:type="dxa" w:w="45"/>
+              <w:right w:type="dxa" w:w="85"/>
+            </w:tcMar>
+          </w:tcPr>
+          <w:p>
+            <w:pPr>
+              <w:spacing w:after="20"/>
+            </w:pPr>
+            <w:r>
+              <w:rPr>
+                <w:rFonts w:ascii="Calibri" w:cs="Calibri" w:eastAsia="Calibri" w:hAnsi="Calibri"/>
+                <w:b w:val="false"/>
+                <w:bCs w:val="false"/>
+                <w:sz w:val="16"/>
+                <w:szCs w:val="16"/>
+              </w:rPr>
+              <w:t xml:space="preserve">"lets keep it fixed for now and keep looking into agent generated weights and how we can reproduce them"</w:t>
+            </w:r>
+          </w:p>
+        </w:tc>
+      </w:tr>
+    </w:tbl>
+    <w:p>
+      <w:pPr>
+        <w:spacing w:after="110" w:before="70" w:line="262"/>
+      </w:pPr>
+      <w:r>
+        <w:rPr>
+          <w:rFonts w:ascii="Calibri" w:cs="Calibri" w:eastAsia="Calibri" w:hAnsi="Calibri"/>
+          <w:i/>
+          <w:iCs/>
+          <w:sz w:val="18"/>
+          <w:szCs w:val="18"/>
+        </w:rPr>
+        <w:t xml:space="preserve">Student decisions recorded: count open capacity once in a future formula change; keep the formula's constants fixed for now; Slack shelters starting about 30 percent behind is acceptable; investigate agent-generated weights and their reproducibility.</w:t>
+      </w:r>
+    </w:p>
+    <w:p>
+      <w:pPr>
+        <w:keepNext/>
+        <w:spacing w:after="50" w:before="140"/>
+      </w:pPr>
+      <w:r>
+        <w:rPr>
+          <w:rFonts w:ascii="Calibri" w:cs="Calibri" w:eastAsia="Calibri" w:hAnsi="Calibri"/>
+          <w:b/>
+          <w:bCs/>
+          <w:sz w:val="22"/>
+          <w:szCs w:val="22"/>
+        </w:rPr>
+        <w:t xml:space="preserve">Item 2: weight blend and fallback (`lambda/shared/weights.ts`, `deriveWeights`)</w:t>
+      </w:r>
+    </w:p>
+    <w:tbl>
+      <w:tblPr>
+        <w:tblW w:type="dxa" w:w="9720"/>
+        <w:tblBorders>
+          <w:top w:val="single" w:color="A0A0A0" w:sz="4"/>
+          <w:left w:val="single" w:color="A0A0A0" w:sz="4"/>
+          <w:bottom w:val="single" w:color="A0A0A0" w:sz="4"/>
+          <w:right w:val="single" w:color="A0A0A0" w:sz="4"/>
+          <w:insideH w:val="single" w:color="A0A0A0" w:sz="4"/>
+          <w:insideV w:val="single" w:color="A0A0A0" w:sz="4"/>
+        </w:tblBorders>
+      </w:tblPr>
+      <w:tblGrid>
+        <w:gridCol w:w="3700"/>
+        <w:gridCol w:w="6020"/>
+      </w:tblGrid>
+      <w:tr>
+        <w:trPr>
+          <w:cantSplit/>
+          <w:tblHeader/>
+        </w:trPr>
+        <w:tc>
+          <w:tcPr>
+            <w:tcW w:type="dxa" w:w="3700"/>
             <w:shd w:fill="E8F3EF" w:val="clear"/>
             <w:tcMar>
               <w:top w:type="dxa" w:w="45"/>
@@ -2269,16 +2767,16 @@
                 <w:rFonts w:ascii="Calibri" w:cs="Calibri" w:eastAsia="Calibri" w:hAnsi="Calibri"/>
                 <w:b/>
                 <w:bCs/>
-                <w:sz w:val="17"/>
-                <w:szCs w:val="17"/>
-              </w:rPr>
-              <w:t xml:space="preserve">What I found or challenged</w:t>
-            </w:r>
-          </w:p>
-        </w:tc>
-        <w:tc>
-          <w:tcPr>
-            <w:tcW w:type="dxa" w:w="1800"/>
+                <w:sz w:val="16"/>
+                <w:szCs w:val="16"/>
+              </w:rPr>
+              <w:t xml:space="preserve">Question the AI asked</w:t>
+            </w:r>
+          </w:p>
+        </w:tc>
+        <w:tc>
+          <w:tcPr>
+            <w:tcW w:type="dxa" w:w="6020"/>
             <w:shd w:fill="E8F3EF" w:val="clear"/>
             <w:tcMar>
               <w:top w:type="dxa" w:w="45"/>
@@ -2296,560 +2794,1554 @@
                 <w:rFonts w:ascii="Calibri" w:cs="Calibri" w:eastAsia="Calibri" w:hAnsi="Calibri"/>
                 <w:b/>
                 <w:bCs/>
-                <w:sz w:val="17"/>
-                <w:szCs w:val="17"/>
-              </w:rPr>
-              <w:t xml:space="preserve">Keep / change / ask</w:t>
-            </w:r>
-          </w:p>
-        </w:tc>
-      </w:tr>
-      <w:tr>
-        <w:trPr>
-          <w:cantSplit/>
-          <w:tblHeader w:val="off"/>
-        </w:trPr>
-        <w:tc>
-          <w:tcPr>
-            <w:tcW w:type="dxa" w:w="2000"/>
-            <w:tcMar>
-              <w:top w:type="dxa" w:w="45"/>
-              <w:left w:type="dxa" w:w="85"/>
-              <w:bottom w:type="dxa" w:w="45"/>
-              <w:right w:type="dxa" w:w="85"/>
-            </w:tcMar>
-          </w:tcPr>
-          <w:p>
-            <w:pPr>
-              <w:spacing w:after="20"/>
-            </w:pPr>
-            <w:r>
-              <w:rPr>
-                <w:rFonts w:ascii="Calibri" w:cs="Calibri" w:eastAsia="Calibri" w:hAnsi="Calibri"/>
-                <w:b w:val="false"/>
-                <w:bCs w:val="false"/>
-                <w:sz w:val="17"/>
-                <w:szCs w:val="17"/>
-              </w:rPr>
-              <w:t xml:space="preserve"/>
-            </w:r>
-          </w:p>
-        </w:tc>
-        <w:tc>
-          <w:tcPr>
-            <w:tcW w:type="dxa" w:w="2700"/>
-            <w:tcMar>
-              <w:top w:type="dxa" w:w="45"/>
-              <w:left w:type="dxa" w:w="85"/>
-              <w:bottom w:type="dxa" w:w="45"/>
-              <w:right w:type="dxa" w:w="85"/>
-            </w:tcMar>
-          </w:tcPr>
-          <w:p>
-            <w:pPr>
-              <w:spacing w:after="20"/>
-            </w:pPr>
-            <w:r>
-              <w:rPr>
-                <w:rFonts w:ascii="Calibri" w:cs="Calibri" w:eastAsia="Calibri" w:hAnsi="Calibri"/>
-                <w:b w:val="false"/>
-                <w:bCs w:val="false"/>
-                <w:sz w:val="17"/>
-                <w:szCs w:val="17"/>
-              </w:rPr>
-              <w:t xml:space="preserve"/>
-            </w:r>
-          </w:p>
-        </w:tc>
-        <w:tc>
-          <w:tcPr>
-            <w:tcW w:type="dxa" w:w="3220"/>
-            <w:tcMar>
-              <w:top w:type="dxa" w:w="45"/>
-              <w:left w:type="dxa" w:w="85"/>
-              <w:bottom w:type="dxa" w:w="45"/>
-              <w:right w:type="dxa" w:w="85"/>
-            </w:tcMar>
-          </w:tcPr>
-          <w:p>
-            <w:pPr>
-              <w:spacing w:after="20"/>
-            </w:pPr>
-            <w:r>
-              <w:rPr>
-                <w:rFonts w:ascii="Calibri" w:cs="Calibri" w:eastAsia="Calibri" w:hAnsi="Calibri"/>
-                <w:b w:val="false"/>
-                <w:bCs w:val="false"/>
-                <w:sz w:val="17"/>
-                <w:szCs w:val="17"/>
-              </w:rPr>
-              <w:t xml:space="preserve"/>
-            </w:r>
-          </w:p>
-        </w:tc>
-        <w:tc>
-          <w:tcPr>
-            <w:tcW w:type="dxa" w:w="1800"/>
-            <w:tcMar>
-              <w:top w:type="dxa" w:w="45"/>
-              <w:left w:type="dxa" w:w="85"/>
-              <w:bottom w:type="dxa" w:w="45"/>
-              <w:right w:type="dxa" w:w="85"/>
-            </w:tcMar>
-          </w:tcPr>
-          <w:p>
-            <w:pPr>
-              <w:spacing w:after="20"/>
-            </w:pPr>
-            <w:r>
-              <w:rPr>
-                <w:rFonts w:ascii="Calibri" w:cs="Calibri" w:eastAsia="Calibri" w:hAnsi="Calibri"/>
-                <w:b w:val="false"/>
-                <w:bCs w:val="false"/>
-                <w:sz w:val="17"/>
-                <w:szCs w:val="17"/>
-              </w:rPr>
-              <w:t xml:space="preserve"/>
-            </w:r>
-          </w:p>
-        </w:tc>
-      </w:tr>
-      <w:tr>
-        <w:trPr>
-          <w:cantSplit/>
-          <w:tblHeader w:val="off"/>
-        </w:trPr>
-        <w:tc>
-          <w:tcPr>
-            <w:tcW w:type="dxa" w:w="2000"/>
-            <w:tcMar>
-              <w:top w:type="dxa" w:w="45"/>
-              <w:left w:type="dxa" w:w="85"/>
-              <w:bottom w:type="dxa" w:w="45"/>
-              <w:right w:type="dxa" w:w="85"/>
-            </w:tcMar>
-          </w:tcPr>
-          <w:p>
-            <w:pPr>
-              <w:spacing w:after="20"/>
-            </w:pPr>
-            <w:r>
-              <w:rPr>
-                <w:rFonts w:ascii="Calibri" w:cs="Calibri" w:eastAsia="Calibri" w:hAnsi="Calibri"/>
-                <w:b w:val="false"/>
-                <w:bCs w:val="false"/>
-                <w:sz w:val="17"/>
-                <w:szCs w:val="17"/>
-              </w:rPr>
-              <w:t xml:space="preserve"/>
-            </w:r>
-          </w:p>
-        </w:tc>
-        <w:tc>
-          <w:tcPr>
-            <w:tcW w:type="dxa" w:w="2700"/>
-            <w:tcMar>
-              <w:top w:type="dxa" w:w="45"/>
-              <w:left w:type="dxa" w:w="85"/>
-              <w:bottom w:type="dxa" w:w="45"/>
-              <w:right w:type="dxa" w:w="85"/>
-            </w:tcMar>
-          </w:tcPr>
-          <w:p>
-            <w:pPr>
-              <w:spacing w:after="20"/>
-            </w:pPr>
-            <w:r>
-              <w:rPr>
-                <w:rFonts w:ascii="Calibri" w:cs="Calibri" w:eastAsia="Calibri" w:hAnsi="Calibri"/>
-                <w:b w:val="false"/>
-                <w:bCs w:val="false"/>
-                <w:sz w:val="17"/>
-                <w:szCs w:val="17"/>
-              </w:rPr>
-              <w:t xml:space="preserve"/>
-            </w:r>
-          </w:p>
-        </w:tc>
-        <w:tc>
-          <w:tcPr>
-            <w:tcW w:type="dxa" w:w="3220"/>
-            <w:tcMar>
-              <w:top w:type="dxa" w:w="45"/>
-              <w:left w:type="dxa" w:w="85"/>
-              <w:bottom w:type="dxa" w:w="45"/>
-              <w:right w:type="dxa" w:w="85"/>
-            </w:tcMar>
-          </w:tcPr>
-          <w:p>
-            <w:pPr>
-              <w:spacing w:after="20"/>
-            </w:pPr>
-            <w:r>
-              <w:rPr>
-                <w:rFonts w:ascii="Calibri" w:cs="Calibri" w:eastAsia="Calibri" w:hAnsi="Calibri"/>
-                <w:b w:val="false"/>
-                <w:bCs w:val="false"/>
-                <w:sz w:val="17"/>
-                <w:szCs w:val="17"/>
-              </w:rPr>
-              <w:t xml:space="preserve"/>
-            </w:r>
-          </w:p>
-        </w:tc>
-        <w:tc>
-          <w:tcPr>
-            <w:tcW w:type="dxa" w:w="1800"/>
-            <w:tcMar>
-              <w:top w:type="dxa" w:w="45"/>
-              <w:left w:type="dxa" w:w="85"/>
-              <w:bottom w:type="dxa" w:w="45"/>
-              <w:right w:type="dxa" w:w="85"/>
-            </w:tcMar>
-          </w:tcPr>
-          <w:p>
-            <w:pPr>
-              <w:spacing w:after="20"/>
-            </w:pPr>
-            <w:r>
-              <w:rPr>
-                <w:rFonts w:ascii="Calibri" w:cs="Calibri" w:eastAsia="Calibri" w:hAnsi="Calibri"/>
-                <w:b w:val="false"/>
-                <w:bCs w:val="false"/>
-                <w:sz w:val="17"/>
-                <w:szCs w:val="17"/>
-              </w:rPr>
-              <w:t xml:space="preserve"/>
-            </w:r>
-          </w:p>
-        </w:tc>
-      </w:tr>
-      <w:tr>
-        <w:trPr>
-          <w:cantSplit/>
-          <w:tblHeader w:val="off"/>
-        </w:trPr>
-        <w:tc>
-          <w:tcPr>
-            <w:tcW w:type="dxa" w:w="2000"/>
-            <w:tcMar>
-              <w:top w:type="dxa" w:w="45"/>
-              <w:left w:type="dxa" w:w="85"/>
-              <w:bottom w:type="dxa" w:w="45"/>
-              <w:right w:type="dxa" w:w="85"/>
-            </w:tcMar>
-          </w:tcPr>
-          <w:p>
-            <w:pPr>
-              <w:spacing w:after="20"/>
-            </w:pPr>
-            <w:r>
-              <w:rPr>
-                <w:rFonts w:ascii="Calibri" w:cs="Calibri" w:eastAsia="Calibri" w:hAnsi="Calibri"/>
-                <w:b w:val="false"/>
-                <w:bCs w:val="false"/>
-                <w:sz w:val="17"/>
-                <w:szCs w:val="17"/>
-              </w:rPr>
-              <w:t xml:space="preserve"/>
-            </w:r>
-          </w:p>
-        </w:tc>
-        <w:tc>
-          <w:tcPr>
-            <w:tcW w:type="dxa" w:w="2700"/>
-            <w:tcMar>
-              <w:top w:type="dxa" w:w="45"/>
-              <w:left w:type="dxa" w:w="85"/>
-              <w:bottom w:type="dxa" w:w="45"/>
-              <w:right w:type="dxa" w:w="85"/>
-            </w:tcMar>
-          </w:tcPr>
-          <w:p>
-            <w:pPr>
-              <w:spacing w:after="20"/>
-            </w:pPr>
-            <w:r>
-              <w:rPr>
-                <w:rFonts w:ascii="Calibri" w:cs="Calibri" w:eastAsia="Calibri" w:hAnsi="Calibri"/>
-                <w:b w:val="false"/>
-                <w:bCs w:val="false"/>
-                <w:sz w:val="17"/>
-                <w:szCs w:val="17"/>
-              </w:rPr>
-              <w:t xml:space="preserve"/>
-            </w:r>
-          </w:p>
-        </w:tc>
-        <w:tc>
-          <w:tcPr>
-            <w:tcW w:type="dxa" w:w="3220"/>
-            <w:tcMar>
-              <w:top w:type="dxa" w:w="45"/>
-              <w:left w:type="dxa" w:w="85"/>
-              <w:bottom w:type="dxa" w:w="45"/>
-              <w:right w:type="dxa" w:w="85"/>
-            </w:tcMar>
-          </w:tcPr>
-          <w:p>
-            <w:pPr>
-              <w:spacing w:after="20"/>
-            </w:pPr>
-            <w:r>
-              <w:rPr>
-                <w:rFonts w:ascii="Calibri" w:cs="Calibri" w:eastAsia="Calibri" w:hAnsi="Calibri"/>
-                <w:b w:val="false"/>
-                <w:bCs w:val="false"/>
-                <w:sz w:val="17"/>
-                <w:szCs w:val="17"/>
-              </w:rPr>
-              <w:t xml:space="preserve"/>
-            </w:r>
-          </w:p>
-        </w:tc>
-        <w:tc>
-          <w:tcPr>
-            <w:tcW w:type="dxa" w:w="1800"/>
-            <w:tcMar>
-              <w:top w:type="dxa" w:w="45"/>
-              <w:left w:type="dxa" w:w="85"/>
-              <w:bottom w:type="dxa" w:w="45"/>
-              <w:right w:type="dxa" w:w="85"/>
-            </w:tcMar>
-          </w:tcPr>
-          <w:p>
-            <w:pPr>
-              <w:spacing w:after="20"/>
-            </w:pPr>
-            <w:r>
-              <w:rPr>
-                <w:rFonts w:ascii="Calibri" w:cs="Calibri" w:eastAsia="Calibri" w:hAnsi="Calibri"/>
-                <w:b w:val="false"/>
-                <w:bCs w:val="false"/>
-                <w:sz w:val="17"/>
-                <w:szCs w:val="17"/>
-              </w:rPr>
-              <w:t xml:space="preserve"/>
-            </w:r>
-          </w:p>
-        </w:tc>
-      </w:tr>
-      <w:tr>
-        <w:trPr>
-          <w:cantSplit/>
-          <w:tblHeader w:val="off"/>
-        </w:trPr>
-        <w:tc>
-          <w:tcPr>
-            <w:tcW w:type="dxa" w:w="2000"/>
-            <w:tcMar>
-              <w:top w:type="dxa" w:w="45"/>
-              <w:left w:type="dxa" w:w="85"/>
-              <w:bottom w:type="dxa" w:w="45"/>
-              <w:right w:type="dxa" w:w="85"/>
-            </w:tcMar>
-          </w:tcPr>
-          <w:p>
-            <w:pPr>
-              <w:spacing w:after="20"/>
-            </w:pPr>
-            <w:r>
-              <w:rPr>
-                <w:rFonts w:ascii="Calibri" w:cs="Calibri" w:eastAsia="Calibri" w:hAnsi="Calibri"/>
-                <w:b w:val="false"/>
-                <w:bCs w:val="false"/>
-                <w:sz w:val="17"/>
-                <w:szCs w:val="17"/>
-              </w:rPr>
-              <w:t xml:space="preserve"/>
-            </w:r>
-          </w:p>
-        </w:tc>
-        <w:tc>
-          <w:tcPr>
-            <w:tcW w:type="dxa" w:w="2700"/>
-            <w:tcMar>
-              <w:top w:type="dxa" w:w="45"/>
-              <w:left w:type="dxa" w:w="85"/>
-              <w:bottom w:type="dxa" w:w="45"/>
-              <w:right w:type="dxa" w:w="85"/>
-            </w:tcMar>
-          </w:tcPr>
-          <w:p>
-            <w:pPr>
-              <w:spacing w:after="20"/>
-            </w:pPr>
-            <w:r>
-              <w:rPr>
-                <w:rFonts w:ascii="Calibri" w:cs="Calibri" w:eastAsia="Calibri" w:hAnsi="Calibri"/>
-                <w:b w:val="false"/>
-                <w:bCs w:val="false"/>
-                <w:sz w:val="17"/>
-                <w:szCs w:val="17"/>
-              </w:rPr>
-              <w:t xml:space="preserve"/>
-            </w:r>
-          </w:p>
-        </w:tc>
-        <w:tc>
-          <w:tcPr>
-            <w:tcW w:type="dxa" w:w="3220"/>
-            <w:tcMar>
-              <w:top w:type="dxa" w:w="45"/>
-              <w:left w:type="dxa" w:w="85"/>
-              <w:bottom w:type="dxa" w:w="45"/>
-              <w:right w:type="dxa" w:w="85"/>
-            </w:tcMar>
-          </w:tcPr>
-          <w:p>
-            <w:pPr>
-              <w:spacing w:after="20"/>
-            </w:pPr>
-            <w:r>
-              <w:rPr>
-                <w:rFonts w:ascii="Calibri" w:cs="Calibri" w:eastAsia="Calibri" w:hAnsi="Calibri"/>
-                <w:b w:val="false"/>
-                <w:bCs w:val="false"/>
-                <w:sz w:val="17"/>
-                <w:szCs w:val="17"/>
-              </w:rPr>
-              <w:t xml:space="preserve"/>
-            </w:r>
-          </w:p>
-        </w:tc>
-        <w:tc>
-          <w:tcPr>
-            <w:tcW w:type="dxa" w:w="1800"/>
-            <w:tcMar>
-              <w:top w:type="dxa" w:w="45"/>
-              <w:left w:type="dxa" w:w="85"/>
-              <w:bottom w:type="dxa" w:w="45"/>
-              <w:right w:type="dxa" w:w="85"/>
-            </w:tcMar>
-          </w:tcPr>
-          <w:p>
-            <w:pPr>
-              <w:spacing w:after="20"/>
-            </w:pPr>
-            <w:r>
-              <w:rPr>
-                <w:rFonts w:ascii="Calibri" w:cs="Calibri" w:eastAsia="Calibri" w:hAnsi="Calibri"/>
-                <w:b w:val="false"/>
-                <w:bCs w:val="false"/>
-                <w:sz w:val="17"/>
-                <w:szCs w:val="17"/>
-              </w:rPr>
-              <w:t xml:space="preserve"/>
-            </w:r>
-          </w:p>
-        </w:tc>
-      </w:tr>
-      <w:tr>
-        <w:trPr>
-          <w:cantSplit/>
-          <w:tblHeader w:val="off"/>
-        </w:trPr>
-        <w:tc>
-          <w:tcPr>
-            <w:tcW w:type="dxa" w:w="2000"/>
-            <w:tcMar>
-              <w:top w:type="dxa" w:w="45"/>
-              <w:left w:type="dxa" w:w="85"/>
-              <w:bottom w:type="dxa" w:w="45"/>
-              <w:right w:type="dxa" w:w="85"/>
-            </w:tcMar>
-          </w:tcPr>
-          <w:p>
-            <w:pPr>
-              <w:spacing w:after="20"/>
-            </w:pPr>
-            <w:r>
-              <w:rPr>
-                <w:rFonts w:ascii="Calibri" w:cs="Calibri" w:eastAsia="Calibri" w:hAnsi="Calibri"/>
-                <w:b w:val="false"/>
-                <w:bCs w:val="false"/>
-                <w:sz w:val="17"/>
-                <w:szCs w:val="17"/>
-              </w:rPr>
-              <w:t xml:space="preserve"/>
-            </w:r>
-          </w:p>
-        </w:tc>
-        <w:tc>
-          <w:tcPr>
-            <w:tcW w:type="dxa" w:w="2700"/>
-            <w:tcMar>
-              <w:top w:type="dxa" w:w="45"/>
-              <w:left w:type="dxa" w:w="85"/>
-              <w:bottom w:type="dxa" w:w="45"/>
-              <w:right w:type="dxa" w:w="85"/>
-            </w:tcMar>
-          </w:tcPr>
-          <w:p>
-            <w:pPr>
-              <w:spacing w:after="20"/>
-            </w:pPr>
-            <w:r>
-              <w:rPr>
-                <w:rFonts w:ascii="Calibri" w:cs="Calibri" w:eastAsia="Calibri" w:hAnsi="Calibri"/>
-                <w:b w:val="false"/>
-                <w:bCs w:val="false"/>
-                <w:sz w:val="17"/>
-                <w:szCs w:val="17"/>
-              </w:rPr>
-              <w:t xml:space="preserve"/>
-            </w:r>
-          </w:p>
-        </w:tc>
-        <w:tc>
-          <w:tcPr>
-            <w:tcW w:type="dxa" w:w="3220"/>
-            <w:tcMar>
-              <w:top w:type="dxa" w:w="45"/>
-              <w:left w:type="dxa" w:w="85"/>
-              <w:bottom w:type="dxa" w:w="45"/>
-              <w:right w:type="dxa" w:w="85"/>
-            </w:tcMar>
-          </w:tcPr>
-          <w:p>
-            <w:pPr>
-              <w:spacing w:after="20"/>
-            </w:pPr>
-            <w:r>
-              <w:rPr>
-                <w:rFonts w:ascii="Calibri" w:cs="Calibri" w:eastAsia="Calibri" w:hAnsi="Calibri"/>
-                <w:b w:val="false"/>
-                <w:bCs w:val="false"/>
-                <w:sz w:val="17"/>
-                <w:szCs w:val="17"/>
-              </w:rPr>
-              <w:t xml:space="preserve"/>
-            </w:r>
-          </w:p>
-        </w:tc>
-        <w:tc>
-          <w:tcPr>
-            <w:tcW w:type="dxa" w:w="1800"/>
-            <w:tcMar>
-              <w:top w:type="dxa" w:w="45"/>
-              <w:left w:type="dxa" w:w="85"/>
-              <w:bottom w:type="dxa" w:w="45"/>
-              <w:right w:type="dxa" w:w="85"/>
-            </w:tcMar>
-          </w:tcPr>
-          <w:p>
-            <w:pPr>
-              <w:spacing w:after="20"/>
-            </w:pPr>
-            <w:r>
-              <w:rPr>
-                <w:rFonts w:ascii="Calibri" w:cs="Calibri" w:eastAsia="Calibri" w:hAnsi="Calibri"/>
-                <w:b w:val="false"/>
-                <w:bCs w:val="false"/>
-                <w:sz w:val="17"/>
-                <w:szCs w:val="17"/>
-              </w:rPr>
-              <w:t xml:space="preserve"/>
+                <w:sz w:val="16"/>
+                <w:szCs w:val="16"/>
+              </w:rPr>
+              <w:t xml:space="preserve">The student's reply (verbatim)</w:t>
+            </w:r>
+          </w:p>
+        </w:tc>
+      </w:tr>
+      <w:tr>
+        <w:trPr>
+          <w:cantSplit/>
+          <w:tblHeader w:val="off"/>
+        </w:trPr>
+        <w:tc>
+          <w:tcPr>
+            <w:tcW w:type="dxa" w:w="3700"/>
+            <w:tcMar>
+              <w:top w:type="dxa" w:w="45"/>
+              <w:left w:type="dxa" w:w="85"/>
+              <w:bottom w:type="dxa" w:w="45"/>
+              <w:right w:type="dxa" w:w="85"/>
+            </w:tcMar>
+          </w:tcPr>
+          <w:p>
+            <w:pPr>
+              <w:spacing w:after="20"/>
+            </w:pPr>
+            <w:r>
+              <w:rPr>
+                <w:rFonts w:ascii="Calibri" w:cs="Calibri" w:eastAsia="Calibri" w:hAnsi="Calibri"/>
+                <w:b w:val="false"/>
+                <w:bCs w:val="false"/>
+                <w:sz w:val="16"/>
+                <w:szCs w:val="16"/>
+              </w:rPr>
+              <w:t xml:space="preserve">The fallback for unusable classifier output is the least urgent type (STABLE_ROUTINE). Is that the right safe default? What would you choose?</w:t>
+            </w:r>
+          </w:p>
+        </w:tc>
+        <w:tc>
+          <w:tcPr>
+            <w:tcW w:type="dxa" w:w="6020"/>
+            <w:tcMar>
+              <w:top w:type="dxa" w:w="45"/>
+              <w:left w:type="dxa" w:w="85"/>
+              <w:bottom w:type="dxa" w:w="45"/>
+              <w:right w:type="dxa" w:w="85"/>
+            </w:tcMar>
+          </w:tcPr>
+          <w:p>
+            <w:pPr>
+              <w:spacing w:after="20"/>
+            </w:pPr>
+            <w:r>
+              <w:rPr>
+                <w:rFonts w:ascii="Calibri" w:cs="Calibri" w:eastAsia="Calibri" w:hAnsi="Calibri"/>
+                <w:b w:val="false"/>
+                <w:bCs w:val="false"/>
+                <w:sz w:val="16"/>
+                <w:szCs w:val="16"/>
+              </w:rPr>
+              <w:t xml:space="preserve">"how do we stop it from returning garbage? i would treat a case we dont have visibility into at highest severity. better to be safe than sorry"</w:t>
+            </w:r>
+          </w:p>
+        </w:tc>
+      </w:tr>
+      <w:tr>
+        <w:trPr>
+          <w:cantSplit/>
+          <w:tblHeader w:val="off"/>
+        </w:trPr>
+        <w:tc>
+          <w:tcPr>
+            <w:tcW w:type="dxa" w:w="3700"/>
+            <w:tcMar>
+              <w:top w:type="dxa" w:w="45"/>
+              <w:left w:type="dxa" w:w="85"/>
+              <w:bottom w:type="dxa" w:w="45"/>
+              <w:right w:type="dxa" w:w="85"/>
+            </w:tcMar>
+          </w:tcPr>
+          <w:p>
+            <w:pPr>
+              <w:spacing w:after="20"/>
+            </w:pPr>
+            <w:r>
+              <w:rPr>
+                <w:rFonts w:ascii="Calibri" w:cs="Calibri" w:eastAsia="Calibri" w:hAnsi="Calibri"/>
+                <w:b w:val="false"/>
+                <w:bCs w:val="false"/>
+                <w:sz w:val="16"/>
+                <w:szCs w:val="16"/>
+              </w:rPr>
+              <w:t xml:space="preserve">Probabilities that do not sum to 1 are silently rescaled. OK, or a failure?</w:t>
+            </w:r>
+          </w:p>
+        </w:tc>
+        <w:tc>
+          <w:tcPr>
+            <w:tcW w:type="dxa" w:w="6020"/>
+            <w:tcMar>
+              <w:top w:type="dxa" w:w="45"/>
+              <w:left w:type="dxa" w:w="85"/>
+              <w:bottom w:type="dxa" w:w="45"/>
+              <w:right w:type="dxa" w:w="85"/>
+            </w:tcMar>
+          </w:tcPr>
+          <w:p>
+            <w:pPr>
+              <w:spacing w:after="20"/>
+            </w:pPr>
+            <w:r>
+              <w:rPr>
+                <w:rFonts w:ascii="Calibri" w:cs="Calibri" w:eastAsia="Calibri" w:hAnsi="Calibri"/>
+                <w:b w:val="false"/>
+                <w:bCs w:val="false"/>
+                <w:sz w:val="16"/>
+                <w:szCs w:val="16"/>
+              </w:rPr>
+              <w:t xml:space="preserve">"ok to rescale them as long as the original ratios are retained"</w:t>
+            </w:r>
+          </w:p>
+        </w:tc>
+      </w:tr>
+    </w:tbl>
+    <w:p>
+      <w:pPr>
+        <w:spacing w:after="110" w:before="70" w:line="262"/>
+      </w:pPr>
+      <w:r>
+        <w:rPr>
+          <w:rFonts w:ascii="Calibri" w:cs="Calibri" w:eastAsia="Calibri" w:hAnsi="Calibri"/>
+          <w:i/>
+          <w:iCs/>
+          <w:sz w:val="18"/>
+          <w:szCs w:val="18"/>
+        </w:rPr>
+        <w:t xml:space="preserve">Student decision recorded: when the classifier output is unusable, treat the case as highest severity (INJURED_CRITICAL), not as STABLE_ROUTINE. This reverses the design in Hard Stop 2, Section 5.3, and is not yet implemented: it will change `FALLBACK_ARCHETYPE`, the SYN-08 expectation, the tests, and the deployed function. Rescaling is acceptable because dividing by the total keeps the ratios exactly.</w:t>
+      </w:r>
+    </w:p>
+    <w:p>
+      <w:pPr>
+        <w:keepNext/>
+        <w:spacing w:after="50" w:before="140"/>
+      </w:pPr>
+      <w:r>
+        <w:rPr>
+          <w:rFonts w:ascii="Calibri" w:cs="Calibri" w:eastAsia="Calibri" w:hAnsi="Calibri"/>
+          <w:b/>
+          <w:bCs/>
+          <w:sz w:val="22"/>
+          <w:szCs w:val="22"/>
+        </w:rPr>
+        <w:t xml:space="preserve">Item 3: the classifier path (`needs-profile` v2, `parseClassifierResponse`, and the failure handling)</w:t>
+      </w:r>
+    </w:p>
+    <w:tbl>
+      <w:tblPr>
+        <w:tblW w:type="dxa" w:w="9720"/>
+        <w:tblBorders>
+          <w:top w:val="single" w:color="A0A0A0" w:sz="4"/>
+          <w:left w:val="single" w:color="A0A0A0" w:sz="4"/>
+          <w:bottom w:val="single" w:color="A0A0A0" w:sz="4"/>
+          <w:right w:val="single" w:color="A0A0A0" w:sz="4"/>
+          <w:insideH w:val="single" w:color="A0A0A0" w:sz="4"/>
+          <w:insideV w:val="single" w:color="A0A0A0" w:sz="4"/>
+        </w:tblBorders>
+      </w:tblPr>
+      <w:tblGrid>
+        <w:gridCol w:w="3700"/>
+        <w:gridCol w:w="6020"/>
+      </w:tblGrid>
+      <w:tr>
+        <w:trPr>
+          <w:cantSplit/>
+          <w:tblHeader/>
+        </w:trPr>
+        <w:tc>
+          <w:tcPr>
+            <w:tcW w:type="dxa" w:w="3700"/>
+            <w:shd w:fill="E8F3EF" w:val="clear"/>
+            <w:tcMar>
+              <w:top w:type="dxa" w:w="45"/>
+              <w:left w:type="dxa" w:w="85"/>
+              <w:bottom w:type="dxa" w:w="45"/>
+              <w:right w:type="dxa" w:w="85"/>
+            </w:tcMar>
+          </w:tcPr>
+          <w:p>
+            <w:pPr>
+              <w:spacing w:after="20"/>
+            </w:pPr>
+            <w:r>
+              <w:rPr>
+                <w:rFonts w:ascii="Calibri" w:cs="Calibri" w:eastAsia="Calibri" w:hAnsi="Calibri"/>
+                <w:b/>
+                <w:bCs/>
+                <w:sz w:val="16"/>
+                <w:szCs w:val="16"/>
+              </w:rPr>
+              <w:t xml:space="preserve">Question the AI asked</w:t>
+            </w:r>
+          </w:p>
+        </w:tc>
+        <w:tc>
+          <w:tcPr>
+            <w:tcW w:type="dxa" w:w="6020"/>
+            <w:shd w:fill="E8F3EF" w:val="clear"/>
+            <w:tcMar>
+              <w:top w:type="dxa" w:w="45"/>
+              <w:left w:type="dxa" w:w="85"/>
+              <w:bottom w:type="dxa" w:w="45"/>
+              <w:right w:type="dxa" w:w="85"/>
+            </w:tcMar>
+          </w:tcPr>
+          <w:p>
+            <w:pPr>
+              <w:spacing w:after="20"/>
+            </w:pPr>
+            <w:r>
+              <w:rPr>
+                <w:rFonts w:ascii="Calibri" w:cs="Calibri" w:eastAsia="Calibri" w:hAnsi="Calibri"/>
+                <w:b/>
+                <w:bCs/>
+                <w:sz w:val="16"/>
+                <w:szCs w:val="16"/>
+              </w:rPr>
+              <w:t xml:space="preserve">The student's reply (verbatim)</w:t>
+            </w:r>
+          </w:p>
+        </w:tc>
+      </w:tr>
+      <w:tr>
+        <w:trPr>
+          <w:cantSplit/>
+          <w:tblHeader w:val="off"/>
+        </w:trPr>
+        <w:tc>
+          <w:tcPr>
+            <w:tcW w:type="dxa" w:w="3700"/>
+            <w:tcMar>
+              <w:top w:type="dxa" w:w="45"/>
+              <w:left w:type="dxa" w:w="85"/>
+              <w:bottom w:type="dxa" w:w="45"/>
+              <w:right w:type="dxa" w:w="85"/>
+            </w:tcMar>
+          </w:tcPr>
+          <w:p>
+            <w:pPr>
+              <w:spacing w:after="20"/>
+            </w:pPr>
+            <w:r>
+              <w:rPr>
+                <w:rFonts w:ascii="Calibri" w:cs="Calibri" w:eastAsia="Calibri" w:hAnsi="Calibri"/>
+                <w:b w:val="false"/>
+                <w:bCs w:val="false"/>
+                <w:sz w:val="16"/>
+                <w:szCs w:val="16"/>
+              </w:rPr>
+              <w:t xml:space="preserve">The parser rejects `accepts_species:Dog` (capital D) and discards the whole response. Too strict, about right, or too loose?</w:t>
+            </w:r>
+          </w:p>
+        </w:tc>
+        <w:tc>
+          <w:tcPr>
+            <w:tcW w:type="dxa" w:w="6020"/>
+            <w:tcMar>
+              <w:top w:type="dxa" w:w="45"/>
+              <w:left w:type="dxa" w:w="85"/>
+              <w:bottom w:type="dxa" w:w="45"/>
+              <w:right w:type="dxa" w:w="85"/>
+            </w:tcMar>
+          </w:tcPr>
+          <w:p>
+            <w:pPr>
+              <w:spacing w:after="20"/>
+            </w:pPr>
+            <w:r>
+              <w:rPr>
+                <w:rFonts w:ascii="Calibri" w:cs="Calibri" w:eastAsia="Calibri" w:hAnsi="Calibri"/>
+                <w:b w:val="false"/>
+                <w:bCs w:val="false"/>
+                <w:sz w:val="16"/>
+                <w:szCs w:val="16"/>
+              </w:rPr>
+              <w:t xml:space="preserve">"yes this is alright for now, but we should look into temporary options where a shelter that wouldn't normally take in dogs would be willing to at least treat injuries if any or hold for a while until another shelter confirms they can take it in"</w:t>
+            </w:r>
+          </w:p>
+        </w:tc>
+      </w:tr>
+      <w:tr>
+        <w:trPr>
+          <w:cantSplit/>
+          <w:tblHeader w:val="off"/>
+        </w:trPr>
+        <w:tc>
+          <w:tcPr>
+            <w:tcW w:type="dxa" w:w="3700"/>
+            <w:tcMar>
+              <w:top w:type="dxa" w:w="45"/>
+              <w:left w:type="dxa" w:w="85"/>
+              <w:bottom w:type="dxa" w:w="45"/>
+              <w:right w:type="dxa" w:w="85"/>
+            </w:tcMar>
+          </w:tcPr>
+          <w:p>
+            <w:pPr>
+              <w:spacing w:after="20"/>
+            </w:pPr>
+            <w:r>
+              <w:rPr>
+                <w:rFonts w:ascii="Calibri" w:cs="Calibri" w:eastAsia="Calibri" w:hAnsi="Calibri"/>
+                <w:b w:val="false"/>
+                <w:bCs w:val="false"/>
+                <w:sz w:val="16"/>
+                <w:szCs w:val="16"/>
+              </w:rPr>
+              <w:t xml:space="preserve">On failure the fallback looks for injuries only in the photo analysis, so a text-only report ("bleeding, can't stand") would not require a vet. Should a failed classifier always require a vet?</w:t>
+            </w:r>
+          </w:p>
+        </w:tc>
+        <w:tc>
+          <w:tcPr>
+            <w:tcW w:type="dxa" w:w="6020"/>
+            <w:tcMar>
+              <w:top w:type="dxa" w:w="45"/>
+              <w:left w:type="dxa" w:w="85"/>
+              <w:bottom w:type="dxa" w:w="45"/>
+              <w:right w:type="dxa" w:w="85"/>
+            </w:tcMar>
+          </w:tcPr>
+          <w:p>
+            <w:pPr>
+              <w:spacing w:after="20"/>
+            </w:pPr>
+            <w:r>
+              <w:rPr>
+                <w:rFonts w:ascii="Calibri" w:cs="Calibri" w:eastAsia="Calibri" w:hAnsi="Calibri"/>
+                <w:b w:val="false"/>
+                <w:bCs w:val="false"/>
+                <w:sz w:val="16"/>
+                <w:szCs w:val="16"/>
+              </w:rPr>
+              <w:t xml:space="preserve">"not a failed classifier but can we not do only photo analysis - it's the whole reason we have free text input"</w:t>
+            </w:r>
+          </w:p>
+        </w:tc>
+      </w:tr>
+      <w:tr>
+        <w:trPr>
+          <w:cantSplit/>
+          <w:tblHeader w:val="off"/>
+        </w:trPr>
+        <w:tc>
+          <w:tcPr>
+            <w:tcW w:type="dxa" w:w="3700"/>
+            <w:tcMar>
+              <w:top w:type="dxa" w:w="45"/>
+              <w:left w:type="dxa" w:w="85"/>
+              <w:bottom w:type="dxa" w:w="45"/>
+              <w:right w:type="dxa" w:w="85"/>
+            </w:tcMar>
+          </w:tcPr>
+          <w:p>
+            <w:pPr>
+              <w:spacing w:after="20"/>
+            </w:pPr>
+            <w:r>
+              <w:rPr>
+                <w:rFonts w:ascii="Calibri" w:cs="Calibri" w:eastAsia="Calibri" w:hAnsi="Calibri"/>
+                <w:b w:val="false"/>
+                <w:bCs w:val="false"/>
+                <w:sz w:val="16"/>
+                <w:szCs w:val="16"/>
+              </w:rPr>
+              <w:t xml:space="preserve">If the AI call hangs, the function times out and the arbitrator falls back to a hard-coded profile with no constraints. Acceptable?</w:t>
+            </w:r>
+          </w:p>
+        </w:tc>
+        <w:tc>
+          <w:tcPr>
+            <w:tcW w:type="dxa" w:w="6020"/>
+            <w:tcMar>
+              <w:top w:type="dxa" w:w="45"/>
+              <w:left w:type="dxa" w:w="85"/>
+              <w:bottom w:type="dxa" w:w="45"/>
+              <w:right w:type="dxa" w:w="85"/>
+            </w:tcMar>
+          </w:tcPr>
+          <w:p>
+            <w:pPr>
+              <w:spacing w:after="20"/>
+            </w:pPr>
+            <w:r>
+              <w:rPr>
+                <w:rFonts w:ascii="Calibri" w:cs="Calibri" w:eastAsia="Calibri" w:hAnsi="Calibri"/>
+                <w:b w:val="false"/>
+                <w:bCs w:val="false"/>
+                <w:sz w:val="16"/>
+                <w:szCs w:val="16"/>
+              </w:rPr>
+              <w:t xml:space="preserve">"acceptable"</w:t>
+            </w:r>
+          </w:p>
+        </w:tc>
+      </w:tr>
+    </w:tbl>
+    <w:p>
+      <w:pPr>
+        <w:spacing w:after="110" w:before="70" w:line="262"/>
+      </w:pPr>
+      <w:r>
+        <w:rPr>
+          <w:rFonts w:ascii="Calibri" w:cs="Calibri" w:eastAsia="Calibri" w:hAnsi="Calibri"/>
+          <w:i/>
+          <w:iCs/>
+          <w:sz w:val="18"/>
+          <w:szCs w:val="18"/>
+        </w:rPr>
+        <w:t xml:space="preserve">Student decisions recorded: the strict parser is acceptable for now. Future idea raised by the student: temporary emergency options, where a shelter that would not normally take a species can treat injuries or hold the animal until a suitable shelter confirms. Injury detection must not depend only on photo analysis: free text must count, because free text is the reason the input exists. The arbitrator's hard-coded default profile is acceptable.</w:t>
+      </w:r>
+    </w:p>
+    <w:p>
+      <w:pPr>
+        <w:keepNext/>
+        <w:spacing w:after="50" w:before="140"/>
+      </w:pPr>
+      <w:r>
+        <w:rPr>
+          <w:rFonts w:ascii="Calibri" w:cs="Calibri" w:eastAsia="Calibri" w:hAnsi="Calibri"/>
+          <w:b/>
+          <w:bCs/>
+          <w:sz w:val="22"/>
+          <w:szCs w:val="22"/>
+        </w:rPr>
+        <w:t xml:space="preserve">Item 4: the evaluation harness tie rule (`eval/harness.ts`, `pickWinner`)</w:t>
+      </w:r>
+    </w:p>
+    <w:tbl>
+      <w:tblPr>
+        <w:tblW w:type="dxa" w:w="9720"/>
+        <w:tblBorders>
+          <w:top w:val="single" w:color="A0A0A0" w:sz="4"/>
+          <w:left w:val="single" w:color="A0A0A0" w:sz="4"/>
+          <w:bottom w:val="single" w:color="A0A0A0" w:sz="4"/>
+          <w:right w:val="single" w:color="A0A0A0" w:sz="4"/>
+          <w:insideH w:val="single" w:color="A0A0A0" w:sz="4"/>
+          <w:insideV w:val="single" w:color="A0A0A0" w:sz="4"/>
+        </w:tblBorders>
+      </w:tblPr>
+      <w:tblGrid>
+        <w:gridCol w:w="3700"/>
+        <w:gridCol w:w="6020"/>
+      </w:tblGrid>
+      <w:tr>
+        <w:trPr>
+          <w:cantSplit/>
+          <w:tblHeader/>
+        </w:trPr>
+        <w:tc>
+          <w:tcPr>
+            <w:tcW w:type="dxa" w:w="3700"/>
+            <w:shd w:fill="E8F3EF" w:val="clear"/>
+            <w:tcMar>
+              <w:top w:type="dxa" w:w="45"/>
+              <w:left w:type="dxa" w:w="85"/>
+              <w:bottom w:type="dxa" w:w="45"/>
+              <w:right w:type="dxa" w:w="85"/>
+            </w:tcMar>
+          </w:tcPr>
+          <w:p>
+            <w:pPr>
+              <w:spacing w:after="20"/>
+            </w:pPr>
+            <w:r>
+              <w:rPr>
+                <w:rFonts w:ascii="Calibri" w:cs="Calibri" w:eastAsia="Calibri" w:hAnsi="Calibri"/>
+                <w:b/>
+                <w:bCs/>
+                <w:sz w:val="16"/>
+                <w:szCs w:val="16"/>
+              </w:rPr>
+              <w:t xml:space="preserve">Question the AI asked</w:t>
+            </w:r>
+          </w:p>
+        </w:tc>
+        <w:tc>
+          <w:tcPr>
+            <w:tcW w:type="dxa" w:w="6020"/>
+            <w:shd w:fill="E8F3EF" w:val="clear"/>
+            <w:tcMar>
+              <w:top w:type="dxa" w:w="45"/>
+              <w:left w:type="dxa" w:w="85"/>
+              <w:bottom w:type="dxa" w:w="45"/>
+              <w:right w:type="dxa" w:w="85"/>
+            </w:tcMar>
+          </w:tcPr>
+          <w:p>
+            <w:pPr>
+              <w:spacing w:after="20"/>
+            </w:pPr>
+            <w:r>
+              <w:rPr>
+                <w:rFonts w:ascii="Calibri" w:cs="Calibri" w:eastAsia="Calibri" w:hAnsi="Calibri"/>
+                <w:b/>
+                <w:bCs/>
+                <w:sz w:val="16"/>
+                <w:szCs w:val="16"/>
+              </w:rPr>
+              <w:t xml:space="preserve">The student's reply (verbatim)</w:t>
+            </w:r>
+          </w:p>
+        </w:tc>
+      </w:tr>
+      <w:tr>
+        <w:trPr>
+          <w:cantSplit/>
+          <w:tblHeader w:val="off"/>
+        </w:trPr>
+        <w:tc>
+          <w:tcPr>
+            <w:tcW w:type="dxa" w:w="3700"/>
+            <w:tcMar>
+              <w:top w:type="dxa" w:w="45"/>
+              <w:left w:type="dxa" w:w="85"/>
+              <w:bottom w:type="dxa" w:w="45"/>
+              <w:right w:type="dxa" w:w="85"/>
+            </w:tcMar>
+          </w:tcPr>
+          <w:p>
+            <w:pPr>
+              <w:spacing w:after="20"/>
+            </w:pPr>
+            <w:r>
+              <w:rPr>
+                <w:rFonts w:ascii="Calibri" w:cs="Calibri" w:eastAsia="Calibri" w:hAnsi="Calibri"/>
+                <w:b w:val="false"/>
+                <w:bCs w:val="false"/>
+                <w:sz w:val="16"/>
+                <w:szCs w:val="16"/>
+              </w:rPr>
+              <w:t xml:space="preserve">The tie rule gives a near-tie (within 0.02) to the alphabetically smaller shelter id. Keep it, or report near-ties as undecided?</w:t>
+            </w:r>
+          </w:p>
+        </w:tc>
+        <w:tc>
+          <w:tcPr>
+            <w:tcW w:type="dxa" w:w="6020"/>
+            <w:tcMar>
+              <w:top w:type="dxa" w:w="45"/>
+              <w:left w:type="dxa" w:w="85"/>
+              <w:bottom w:type="dxa" w:w="45"/>
+              <w:right w:type="dxa" w:w="85"/>
+            </w:tcMar>
+          </w:tcPr>
+          <w:p>
+            <w:pPr>
+              <w:spacing w:after="20"/>
+            </w:pPr>
+            <w:r>
+              <w:rPr>
+                <w:rFonts w:ascii="Calibri" w:cs="Calibri" w:eastAsia="Calibri" w:hAnsi="Calibri"/>
+                <w:b w:val="false"/>
+                <w:bCs w:val="false"/>
+                <w:sz w:val="16"/>
+                <w:szCs w:val="16"/>
+              </w:rPr>
+              <w:t xml:space="preserve">"we should have an ultimate tie breaker like distance or how well shelters have responded previously - maybe as a future feature. for now alphabetical works"</w:t>
+            </w:r>
+          </w:p>
+        </w:tc>
+      </w:tr>
+      <w:tr>
+        <w:trPr>
+          <w:cantSplit/>
+          <w:tblHeader w:val="off"/>
+        </w:trPr>
+        <w:tc>
+          <w:tcPr>
+            <w:tcW w:type="dxa" w:w="3700"/>
+            <w:tcMar>
+              <w:top w:type="dxa" w:w="45"/>
+              <w:left w:type="dxa" w:w="85"/>
+              <w:bottom w:type="dxa" w:w="45"/>
+              <w:right w:type="dxa" w:w="85"/>
+            </w:tcMar>
+          </w:tcPr>
+          <w:p>
+            <w:pPr>
+              <w:spacing w:after="20"/>
+            </w:pPr>
+            <w:r>
+              <w:rPr>
+                <w:rFonts w:ascii="Calibri" w:cs="Calibri" w:eastAsia="Calibri" w:hAnsi="Calibri"/>
+                <w:b w:val="false"/>
+                <w:bCs w:val="false"/>
+                <w:sz w:val="16"/>
+                <w:szCs w:val="16"/>
+              </w:rPr>
+              <w:t xml:space="preserve">The ablation excludes cases decided entirely by a hard constraint (only one eligible shelter). Right call?</w:t>
+            </w:r>
+          </w:p>
+        </w:tc>
+        <w:tc>
+          <w:tcPr>
+            <w:tcW w:type="dxa" w:w="6020"/>
+            <w:tcMar>
+              <w:top w:type="dxa" w:w="45"/>
+              <w:left w:type="dxa" w:w="85"/>
+              <w:bottom w:type="dxa" w:w="45"/>
+              <w:right w:type="dxa" w:w="85"/>
+            </w:tcMar>
+          </w:tcPr>
+          <w:p>
+            <w:pPr>
+              <w:spacing w:after="20"/>
+            </w:pPr>
+            <w:r>
+              <w:rPr>
+                <w:rFonts w:ascii="Calibri" w:cs="Calibri" w:eastAsia="Calibri" w:hAnsi="Calibri"/>
+                <w:b w:val="false"/>
+                <w:bCs w:val="false"/>
+                <w:sz w:val="16"/>
+                <w:szCs w:val="16"/>
+              </w:rPr>
+              <w:t xml:space="preserve">"unclear."</w:t>
+            </w:r>
+          </w:p>
+          <w:p>
+            <w:pPr>
+              <w:spacing w:after="20"/>
+            </w:pPr>
+            <w:r>
+              <w:rPr>
+                <w:rFonts w:ascii="Calibri" w:cs="Calibri" w:eastAsia="Calibri" w:hAnsi="Calibri"/>
+                <w:b w:val="false"/>
+                <w:bCs w:val="false"/>
+                <w:sz w:val="16"/>
+                <w:szCs w:val="16"/>
+              </w:rPr>
+              <w:t xml:space="preserve">"yes, it's ok to leave those cases out of comparison"</w:t>
+            </w:r>
+          </w:p>
+          <w:p>
+            <w:pPr>
+              <w:spacing w:after="20"/>
+            </w:pPr>
+            <w:r>
+              <w:rPr>
+                <w:rFonts w:ascii="Calibri" w:cs="Calibri" w:eastAsia="Calibri" w:hAnsi="Calibri"/>
+                <w:b w:val="false"/>
+                <w:bCs w:val="false"/>
+                <w:sz w:val="16"/>
+                <w:szCs w:val="16"/>
+              </w:rPr>
+              <w:t xml:space="preserve">AI note: the question was not clear. It was re-asked in simpler terms: such cases give every method the same answer, so counting them would raise all scores equally and say nothing about the weights.</w:t>
+            </w:r>
+          </w:p>
+        </w:tc>
+      </w:tr>
+    </w:tbl>
+    <w:p>
+      <w:pPr>
+        <w:spacing w:after="110" w:before="70" w:line="262"/>
+      </w:pPr>
+      <w:r>
+        <w:rPr>
+          <w:rFonts w:ascii="Calibri" w:cs="Calibri" w:eastAsia="Calibri" w:hAnsi="Calibri"/>
+          <w:i/>
+          <w:iCs/>
+          <w:sz w:val="18"/>
+          <w:szCs w:val="18"/>
+        </w:rPr>
+        <w:t xml:space="preserve">Student decision recorded: alphabetical tie-break is acceptable for now; a proper tie-breaker such as distance or a shelter's past responsiveness is a future feature.</w:t>
+      </w:r>
+    </w:p>
+    <w:p>
+      <w:pPr>
+        <w:keepNext/>
+        <w:spacing w:after="50" w:before="140"/>
+      </w:pPr>
+      <w:r>
+        <w:rPr>
+          <w:rFonts w:ascii="Calibri" w:cs="Calibri" w:eastAsia="Calibri" w:hAnsi="Calibri"/>
+          <w:b/>
+          <w:bCs/>
+          <w:sz w:val="22"/>
+          <w:szCs w:val="22"/>
+        </w:rPr>
+        <w:t xml:space="preserve">Item 5: the ablation hypotheses and five AHP judgments</w:t>
+      </w:r>
+    </w:p>
+    <w:tbl>
+      <w:tblPr>
+        <w:tblW w:type="dxa" w:w="9720"/>
+        <w:tblBorders>
+          <w:top w:val="single" w:color="A0A0A0" w:sz="4"/>
+          <w:left w:val="single" w:color="A0A0A0" w:sz="4"/>
+          <w:bottom w:val="single" w:color="A0A0A0" w:sz="4"/>
+          <w:right w:val="single" w:color="A0A0A0" w:sz="4"/>
+          <w:insideH w:val="single" w:color="A0A0A0" w:sz="4"/>
+          <w:insideV w:val="single" w:color="A0A0A0" w:sz="4"/>
+        </w:tblBorders>
+      </w:tblPr>
+      <w:tblGrid>
+        <w:gridCol w:w="3700"/>
+        <w:gridCol w:w="6020"/>
+      </w:tblGrid>
+      <w:tr>
+        <w:trPr>
+          <w:cantSplit/>
+          <w:tblHeader/>
+        </w:trPr>
+        <w:tc>
+          <w:tcPr>
+            <w:tcW w:type="dxa" w:w="3700"/>
+            <w:shd w:fill="E8F3EF" w:val="clear"/>
+            <w:tcMar>
+              <w:top w:type="dxa" w:w="45"/>
+              <w:left w:type="dxa" w:w="85"/>
+              <w:bottom w:type="dxa" w:w="45"/>
+              <w:right w:type="dxa" w:w="85"/>
+            </w:tcMar>
+          </w:tcPr>
+          <w:p>
+            <w:pPr>
+              <w:spacing w:after="20"/>
+            </w:pPr>
+            <w:r>
+              <w:rPr>
+                <w:rFonts w:ascii="Calibri" w:cs="Calibri" w:eastAsia="Calibri" w:hAnsi="Calibri"/>
+                <w:b/>
+                <w:bCs/>
+                <w:sz w:val="16"/>
+                <w:szCs w:val="16"/>
+              </w:rPr>
+              <w:t xml:space="preserve">Question the AI asked</w:t>
+            </w:r>
+          </w:p>
+        </w:tc>
+        <w:tc>
+          <w:tcPr>
+            <w:tcW w:type="dxa" w:w="6020"/>
+            <w:shd w:fill="E8F3EF" w:val="clear"/>
+            <w:tcMar>
+              <w:top w:type="dxa" w:w="45"/>
+              <w:left w:type="dxa" w:w="85"/>
+              <w:bottom w:type="dxa" w:w="45"/>
+              <w:right w:type="dxa" w:w="85"/>
+            </w:tcMar>
+          </w:tcPr>
+          <w:p>
+            <w:pPr>
+              <w:spacing w:after="20"/>
+            </w:pPr>
+            <w:r>
+              <w:rPr>
+                <w:rFonts w:ascii="Calibri" w:cs="Calibri" w:eastAsia="Calibri" w:hAnsi="Calibri"/>
+                <w:b/>
+                <w:bCs/>
+                <w:sz w:val="16"/>
+                <w:szCs w:val="16"/>
+              </w:rPr>
+              <w:t xml:space="preserve">The student's reply (verbatim)</w:t>
+            </w:r>
+          </w:p>
+        </w:tc>
+      </w:tr>
+      <w:tr>
+        <w:trPr>
+          <w:cantSplit/>
+          <w:tblHeader w:val="off"/>
+        </w:trPr>
+        <w:tc>
+          <w:tcPr>
+            <w:tcW w:type="dxa" w:w="3700"/>
+            <w:tcMar>
+              <w:top w:type="dxa" w:w="45"/>
+              <w:left w:type="dxa" w:w="85"/>
+              <w:bottom w:type="dxa" w:w="45"/>
+              <w:right w:type="dxa" w:w="85"/>
+            </w:tcMar>
+          </w:tcPr>
+          <w:p>
+            <w:pPr>
+              <w:spacing w:after="20"/>
+            </w:pPr>
+            <w:r>
+              <w:rPr>
+                <w:rFonts w:ascii="Calibri" w:cs="Calibri" w:eastAsia="Calibri" w:hAnsi="Calibri"/>
+                <w:b w:val="false"/>
+                <w:bCs w:val="false"/>
+                <w:sz w:val="16"/>
+                <w:szCs w:val="16"/>
+              </w:rPr>
+              <w:t xml:space="preserve">Part A (the hypotheses H1 to H4 and the formula variants) and Part B (five of the weakest-supported AHP judgments): agree, disagree or unsure, and why?</w:t>
+            </w:r>
+          </w:p>
+        </w:tc>
+        <w:tc>
+          <w:tcPr>
+            <w:tcW w:type="dxa" w:w="6020"/>
+            <w:tcMar>
+              <w:top w:type="dxa" w:w="45"/>
+              <w:left w:type="dxa" w:w="85"/>
+              <w:bottom w:type="dxa" w:w="45"/>
+              <w:right w:type="dxa" w:w="85"/>
+            </w:tcMar>
+          </w:tcPr>
+          <w:p>
+            <w:pPr>
+              <w:spacing w:after="20"/>
+            </w:pPr>
+            <w:r>
+              <w:rPr>
+                <w:rFonts w:ascii="Calibri" w:cs="Calibri" w:eastAsia="Calibri" w:hAnsi="Calibri"/>
+                <w:b w:val="false"/>
+                <w:bCs w:val="false"/>
+                <w:sz w:val="16"/>
+                <w:szCs w:val="16"/>
+              </w:rPr>
+              <w:t xml:space="preserve">"item 5 looks good to me"</w:t>
+            </w:r>
+          </w:p>
+          <w:p>
+            <w:pPr>
+              <w:spacing w:after="20"/>
+            </w:pPr>
+            <w:r>
+              <w:rPr>
+                <w:rFonts w:ascii="Calibri" w:cs="Calibri" w:eastAsia="Calibri" w:hAnsi="Calibri"/>
+                <w:b w:val="false"/>
+                <w:bCs w:val="false"/>
+                <w:sz w:val="16"/>
+                <w:szCs w:val="16"/>
+              </w:rPr>
+              <w:t xml:space="preserve">AI note: this is a general approval. It does not justify, challenge, or change any of the five AHP judgments individually, and it does not say whether the formula variants would satisfy someone who knows shelters. Those parts were not separately answered, so the five AHP judgments remain AI-proposed and student-adopted without an individual review.</w:t>
+            </w:r>
+          </w:p>
+        </w:tc>
+      </w:tr>
+    </w:tbl>
+    <w:p>
+      <w:pPr>
+        <w:pStyle w:val="Heading2"/>
+        <w:keepNext/>
+        <w:spacing w:after="80" w:before="200"/>
+      </w:pPr>
+      <w:r>
+        <w:rPr>
+          <w:rFonts w:ascii="Calibri" w:cs="Calibri" w:eastAsia="Calibri" w:hAnsi="Calibri"/>
+          <w:b/>
+          <w:bCs/>
+          <w:color w:val="0F4C46"/>
+          <w:sz w:val="24"/>
+          <w:szCs w:val="24"/>
+        </w:rPr>
+        <w:t xml:space="preserve">1.4 Decisions that came out of the review (recorded; none applied tonight, so the evidence matches the committed code)</w:t>
+      </w:r>
+    </w:p>
+    <w:tbl>
+      <w:tblPr>
+        <w:tblW w:type="dxa" w:w="9720"/>
+        <w:tblBorders>
+          <w:top w:val="single" w:color="A0A0A0" w:sz="4"/>
+          <w:left w:val="single" w:color="A0A0A0" w:sz="4"/>
+          <w:bottom w:val="single" w:color="A0A0A0" w:sz="4"/>
+          <w:right w:val="single" w:color="A0A0A0" w:sz="4"/>
+          <w:insideH w:val="single" w:color="A0A0A0" w:sz="4"/>
+          <w:insideV w:val="single" w:color="A0A0A0" w:sz="4"/>
+        </w:tblBorders>
+      </w:tblPr>
+      <w:tblGrid>
+        <w:gridCol w:w="3700"/>
+        <w:gridCol w:w="3500"/>
+        <w:gridCol w:w="2520"/>
+      </w:tblGrid>
+      <w:tr>
+        <w:trPr>
+          <w:cantSplit/>
+          <w:tblHeader/>
+        </w:trPr>
+        <w:tc>
+          <w:tcPr>
+            <w:tcW w:type="dxa" w:w="3700"/>
+            <w:shd w:fill="E8F3EF" w:val="clear"/>
+            <w:tcMar>
+              <w:top w:type="dxa" w:w="45"/>
+              <w:left w:type="dxa" w:w="85"/>
+              <w:bottom w:type="dxa" w:w="45"/>
+              <w:right w:type="dxa" w:w="85"/>
+            </w:tcMar>
+          </w:tcPr>
+          <w:p>
+            <w:pPr>
+              <w:spacing w:after="20"/>
+            </w:pPr>
+            <w:r>
+              <w:rPr>
+                <w:rFonts w:ascii="Calibri" w:cs="Calibri" w:eastAsia="Calibri" w:hAnsi="Calibri"/>
+                <w:b/>
+                <w:bCs/>
+                <w:sz w:val="16"/>
+                <w:szCs w:val="16"/>
+              </w:rPr>
+              <w:t xml:space="preserve">Student decision</w:t>
+            </w:r>
+          </w:p>
+        </w:tc>
+        <w:tc>
+          <w:tcPr>
+            <w:tcW w:type="dxa" w:w="3500"/>
+            <w:shd w:fill="E8F3EF" w:val="clear"/>
+            <w:tcMar>
+              <w:top w:type="dxa" w:w="45"/>
+              <w:left w:type="dxa" w:w="85"/>
+              <w:bottom w:type="dxa" w:w="45"/>
+              <w:right w:type="dxa" w:w="85"/>
+            </w:tcMar>
+          </w:tcPr>
+          <w:p>
+            <w:pPr>
+              <w:spacing w:after="20"/>
+            </w:pPr>
+            <w:r>
+              <w:rPr>
+                <w:rFonts w:ascii="Calibri" w:cs="Calibri" w:eastAsia="Calibri" w:hAnsi="Calibri"/>
+                <w:b/>
+                <w:bCs/>
+                <w:sz w:val="16"/>
+                <w:szCs w:val="16"/>
+              </w:rPr>
+              <w:t xml:space="preserve">Consequence</w:t>
+            </w:r>
+          </w:p>
+        </w:tc>
+        <w:tc>
+          <w:tcPr>
+            <w:tcW w:type="dxa" w:w="2520"/>
+            <w:shd w:fill="E8F3EF" w:val="clear"/>
+            <w:tcMar>
+              <w:top w:type="dxa" w:w="45"/>
+              <w:left w:type="dxa" w:w="85"/>
+              <w:bottom w:type="dxa" w:w="45"/>
+              <w:right w:type="dxa" w:w="85"/>
+            </w:tcMar>
+          </w:tcPr>
+          <w:p>
+            <w:pPr>
+              <w:spacing w:after="20"/>
+            </w:pPr>
+            <w:r>
+              <w:rPr>
+                <w:rFonts w:ascii="Calibri" w:cs="Calibri" w:eastAsia="Calibri" w:hAnsi="Calibri"/>
+                <w:b/>
+                <w:bCs/>
+                <w:sz w:val="16"/>
+                <w:szCs w:val="16"/>
+              </w:rPr>
+              <w:t xml:space="preserve">Where it goes</w:t>
+            </w:r>
+          </w:p>
+        </w:tc>
+      </w:tr>
+      <w:tr>
+        <w:trPr>
+          <w:cantSplit/>
+          <w:tblHeader w:val="off"/>
+        </w:trPr>
+        <w:tc>
+          <w:tcPr>
+            <w:tcW w:type="dxa" w:w="3700"/>
+            <w:tcMar>
+              <w:top w:type="dxa" w:w="45"/>
+              <w:left w:type="dxa" w:w="85"/>
+              <w:bottom w:type="dxa" w:w="45"/>
+              <w:right w:type="dxa" w:w="85"/>
+            </w:tcMar>
+          </w:tcPr>
+          <w:p>
+            <w:pPr>
+              <w:spacing w:after="20"/>
+            </w:pPr>
+            <w:r>
+              <w:rPr>
+                <w:rFonts w:ascii="Calibri" w:cs="Calibri" w:eastAsia="Calibri" w:hAnsi="Calibri"/>
+                <w:b w:val="false"/>
+                <w:bCs w:val="false"/>
+                <w:sz w:val="16"/>
+                <w:szCs w:val="16"/>
+              </w:rPr>
+              <w:t xml:space="preserve">Count open capacity once so it is not skewed</w:t>
+            </w:r>
+          </w:p>
+        </w:tc>
+        <w:tc>
+          <w:tcPr>
+            <w:tcW w:type="dxa" w:w="3500"/>
+            <w:tcMar>
+              <w:top w:type="dxa" w:w="45"/>
+              <w:left w:type="dxa" w:w="85"/>
+              <w:bottom w:type="dxa" w:w="45"/>
+              <w:right w:type="dxa" w:w="85"/>
+            </w:tcMar>
+          </w:tcPr>
+          <w:p>
+            <w:pPr>
+              <w:spacing w:after="20"/>
+            </w:pPr>
+            <w:r>
+              <w:rPr>
+                <w:rFonts w:ascii="Calibri" w:cs="Calibri" w:eastAsia="Calibri" w:hAnsi="Calibri"/>
+                <w:b w:val="false"/>
+                <w:bCs w:val="false"/>
+                <w:sz w:val="16"/>
+                <w:szCs w:val="16"/>
+              </w:rPr>
+              <w:t xml:space="preserve">Matches the ablation (F1); needs a minimum-capacity rule with it (KI-22)</w:t>
+            </w:r>
+          </w:p>
+        </w:tc>
+        <w:tc>
+          <w:tcPr>
+            <w:tcW w:type="dxa" w:w="2520"/>
+            <w:tcMar>
+              <w:top w:type="dxa" w:w="45"/>
+              <w:left w:type="dxa" w:w="85"/>
+              <w:bottom w:type="dxa" w:w="45"/>
+              <w:right w:type="dxa" w:w="85"/>
+            </w:tcMar>
+          </w:tcPr>
+          <w:p>
+            <w:pPr>
+              <w:spacing w:after="20"/>
+            </w:pPr>
+            <w:r>
+              <w:rPr>
+                <w:rFonts w:ascii="Calibri" w:cs="Calibri" w:eastAsia="Calibri" w:hAnsi="Calibri"/>
+                <w:b w:val="false"/>
+                <w:bCs w:val="false"/>
+                <w:sz w:val="16"/>
+                <w:szCs w:val="16"/>
+              </w:rPr>
+              <w:t xml:space="preserve">Formula change after the supervisor review; backlog B-02 follow-up</w:t>
+            </w:r>
+          </w:p>
+        </w:tc>
+      </w:tr>
+      <w:tr>
+        <w:trPr>
+          <w:cantSplit/>
+          <w:tblHeader w:val="off"/>
+        </w:trPr>
+        <w:tc>
+          <w:tcPr>
+            <w:tcW w:type="dxa" w:w="3700"/>
+            <w:tcMar>
+              <w:top w:type="dxa" w:w="45"/>
+              <w:left w:type="dxa" w:w="85"/>
+              <w:bottom w:type="dxa" w:w="45"/>
+              <w:right w:type="dxa" w:w="85"/>
+            </w:tcMar>
+          </w:tcPr>
+          <w:p>
+            <w:pPr>
+              <w:spacing w:after="20"/>
+            </w:pPr>
+            <w:r>
+              <w:rPr>
+                <w:rFonts w:ascii="Calibri" w:cs="Calibri" w:eastAsia="Calibri" w:hAnsi="Calibri"/>
+                <w:b w:val="false"/>
+                <w:bCs w:val="false"/>
+                <w:sz w:val="16"/>
+                <w:szCs w:val="16"/>
+              </w:rPr>
+              <w:t xml:space="preserve">When the classifier output is unusable, treat the case as highest severity (INJURED_CRITICAL)</w:t>
+            </w:r>
+          </w:p>
+        </w:tc>
+        <w:tc>
+          <w:tcPr>
+            <w:tcW w:type="dxa" w:w="3500"/>
+            <w:tcMar>
+              <w:top w:type="dxa" w:w="45"/>
+              <w:left w:type="dxa" w:w="85"/>
+              <w:bottom w:type="dxa" w:w="45"/>
+              <w:right w:type="dxa" w:w="85"/>
+            </w:tcMar>
+          </w:tcPr>
+          <w:p>
+            <w:pPr>
+              <w:spacing w:after="20"/>
+            </w:pPr>
+            <w:r>
+              <w:rPr>
+                <w:rFonts w:ascii="Calibri" w:cs="Calibri" w:eastAsia="Calibri" w:hAnsi="Calibri"/>
+                <w:b w:val="false"/>
+                <w:bCs w:val="false"/>
+                <w:sz w:val="16"/>
+                <w:szCs w:val="16"/>
+              </w:rPr>
+              <w:t xml:space="preserve">Reverses the Hard Stop 2 fallback (STABLE_ROUTINE); changes the SYN-08 expectation, the tests, and the deployed function</w:t>
+            </w:r>
+          </w:p>
+        </w:tc>
+        <w:tc>
+          <w:tcPr>
+            <w:tcW w:type="dxa" w:w="2520"/>
+            <w:tcMar>
+              <w:top w:type="dxa" w:w="45"/>
+              <w:left w:type="dxa" w:w="85"/>
+              <w:bottom w:type="dxa" w:w="45"/>
+              <w:right w:type="dxa" w:w="85"/>
+            </w:tcMar>
+          </w:tcPr>
+          <w:p>
+            <w:pPr>
+              <w:spacing w:after="20"/>
+            </w:pPr>
+            <w:r>
+              <w:rPr>
+                <w:rFonts w:ascii="Calibri" w:cs="Calibri" w:eastAsia="Calibri" w:hAnsi="Calibri"/>
+                <w:b w:val="false"/>
+                <w:bCs w:val="false"/>
+                <w:sz w:val="16"/>
+                <w:szCs w:val="16"/>
+              </w:rPr>
+              <w:t xml:space="preserve">Backlog B-14, after this submission</w:t>
+            </w:r>
+          </w:p>
+        </w:tc>
+      </w:tr>
+      <w:tr>
+        <w:trPr>
+          <w:cantSplit/>
+          <w:tblHeader w:val="off"/>
+        </w:trPr>
+        <w:tc>
+          <w:tcPr>
+            <w:tcW w:type="dxa" w:w="3700"/>
+            <w:tcMar>
+              <w:top w:type="dxa" w:w="45"/>
+              <w:left w:type="dxa" w:w="85"/>
+              <w:bottom w:type="dxa" w:w="45"/>
+              <w:right w:type="dxa" w:w="85"/>
+            </w:tcMar>
+          </w:tcPr>
+          <w:p>
+            <w:pPr>
+              <w:spacing w:after="20"/>
+            </w:pPr>
+            <w:r>
+              <w:rPr>
+                <w:rFonts w:ascii="Calibri" w:cs="Calibri" w:eastAsia="Calibri" w:hAnsi="Calibri"/>
+                <w:b w:val="false"/>
+                <w:bCs w:val="false"/>
+                <w:sz w:val="16"/>
+                <w:szCs w:val="16"/>
+              </w:rPr>
+              <w:t xml:space="preserve">Injury detection must also read the free-text report, not only the photo analysis</w:t>
+            </w:r>
+          </w:p>
+        </w:tc>
+        <w:tc>
+          <w:tcPr>
+            <w:tcW w:type="dxa" w:w="3500"/>
+            <w:tcMar>
+              <w:top w:type="dxa" w:w="45"/>
+              <w:left w:type="dxa" w:w="85"/>
+              <w:bottom w:type="dxa" w:w="45"/>
+              <w:right w:type="dxa" w:w="85"/>
+            </w:tcMar>
+          </w:tcPr>
+          <w:p>
+            <w:pPr>
+              <w:spacing w:after="20"/>
+            </w:pPr>
+            <w:r>
+              <w:rPr>
+                <w:rFonts w:ascii="Calibri" w:cs="Calibri" w:eastAsia="Calibri" w:hAnsi="Calibri"/>
+                <w:b w:val="false"/>
+                <w:bCs w:val="false"/>
+                <w:sz w:val="16"/>
+                <w:szCs w:val="16"/>
+              </w:rPr>
+              <w:t xml:space="preserve">Rule-based fallback and constraints are photo-only today (KI-23)</w:t>
+            </w:r>
+          </w:p>
+        </w:tc>
+        <w:tc>
+          <w:tcPr>
+            <w:tcW w:type="dxa" w:w="2520"/>
+            <w:tcMar>
+              <w:top w:type="dxa" w:w="45"/>
+              <w:left w:type="dxa" w:w="85"/>
+              <w:bottom w:type="dxa" w:w="45"/>
+              <w:right w:type="dxa" w:w="85"/>
+            </w:tcMar>
+          </w:tcPr>
+          <w:p>
+            <w:pPr>
+              <w:spacing w:after="20"/>
+            </w:pPr>
+            <w:r>
+              <w:rPr>
+                <w:rFonts w:ascii="Calibri" w:cs="Calibri" w:eastAsia="Calibri" w:hAnsi="Calibri"/>
+                <w:b w:val="false"/>
+                <w:bCs w:val="false"/>
+                <w:sz w:val="16"/>
+                <w:szCs w:val="16"/>
+              </w:rPr>
+              <w:t xml:space="preserve">Backlog B-14</w:t>
+            </w:r>
+          </w:p>
+        </w:tc>
+      </w:tr>
+      <w:tr>
+        <w:trPr>
+          <w:cantSplit/>
+          <w:tblHeader w:val="off"/>
+        </w:trPr>
+        <w:tc>
+          <w:tcPr>
+            <w:tcW w:type="dxa" w:w="3700"/>
+            <w:tcMar>
+              <w:top w:type="dxa" w:w="45"/>
+              <w:left w:type="dxa" w:w="85"/>
+              <w:bottom w:type="dxa" w:w="45"/>
+              <w:right w:type="dxa" w:w="85"/>
+            </w:tcMar>
+          </w:tcPr>
+          <w:p>
+            <w:pPr>
+              <w:spacing w:after="20"/>
+            </w:pPr>
+            <w:r>
+              <w:rPr>
+                <w:rFonts w:ascii="Calibri" w:cs="Calibri" w:eastAsia="Calibri" w:hAnsi="Calibri"/>
+                <w:b w:val="false"/>
+                <w:bCs w:val="false"/>
+                <w:sz w:val="16"/>
+                <w:szCs w:val="16"/>
+              </w:rPr>
+              <w:t xml:space="preserve">Keep the formula constants fixed for now; keep investigating agent-generated weights and how to reproduce them</w:t>
+            </w:r>
+          </w:p>
+        </w:tc>
+        <w:tc>
+          <w:tcPr>
+            <w:tcW w:type="dxa" w:w="3500"/>
+            <w:tcMar>
+              <w:top w:type="dxa" w:w="45"/>
+              <w:left w:type="dxa" w:w="85"/>
+              <w:bottom w:type="dxa" w:w="45"/>
+              <w:right w:type="dxa" w:w="85"/>
+            </w:tcMar>
+          </w:tcPr>
+          <w:p>
+            <w:pPr>
+              <w:spacing w:after="20"/>
+            </w:pPr>
+            <w:r>
+              <w:rPr>
+                <w:rFonts w:ascii="Calibri" w:cs="Calibri" w:eastAsia="Calibri" w:hAnsi="Calibri"/>
+                <w:b w:val="false"/>
+                <w:bCs w:val="false"/>
+                <w:sz w:val="16"/>
+                <w:szCs w:val="16"/>
+              </w:rPr>
+              <w:t xml:space="preserve">Next study: repeat the weight-writing prompts and measure their spread (needs live calls; count and cost to be agreed first)</w:t>
+            </w:r>
+          </w:p>
+        </w:tc>
+        <w:tc>
+          <w:tcPr>
+            <w:tcW w:type="dxa" w:w="2520"/>
+            <w:tcMar>
+              <w:top w:type="dxa" w:w="45"/>
+              <w:left w:type="dxa" w:w="85"/>
+              <w:bottom w:type="dxa" w:w="45"/>
+              <w:right w:type="dxa" w:w="85"/>
+            </w:tcMar>
+          </w:tcPr>
+          <w:p>
+            <w:pPr>
+              <w:spacing w:after="20"/>
+            </w:pPr>
+            <w:r>
+              <w:rPr>
+                <w:rFonts w:ascii="Calibri" w:cs="Calibri" w:eastAsia="Calibri" w:hAnsi="Calibri"/>
+                <w:b w:val="false"/>
+                <w:bCs w:val="false"/>
+                <w:sz w:val="16"/>
+                <w:szCs w:val="16"/>
+              </w:rPr>
+              <w:t xml:space="preserve">Backlog B-15</w:t>
+            </w:r>
+          </w:p>
+        </w:tc>
+      </w:tr>
+      <w:tr>
+        <w:trPr>
+          <w:cantSplit/>
+          <w:tblHeader w:val="off"/>
+        </w:trPr>
+        <w:tc>
+          <w:tcPr>
+            <w:tcW w:type="dxa" w:w="3700"/>
+            <w:tcMar>
+              <w:top w:type="dxa" w:w="45"/>
+              <w:left w:type="dxa" w:w="85"/>
+              <w:bottom w:type="dxa" w:w="45"/>
+              <w:right w:type="dxa" w:w="85"/>
+            </w:tcMar>
+          </w:tcPr>
+          <w:p>
+            <w:pPr>
+              <w:spacing w:after="20"/>
+            </w:pPr>
+            <w:r>
+              <w:rPr>
+                <w:rFonts w:ascii="Calibri" w:cs="Calibri" w:eastAsia="Calibri" w:hAnsi="Calibri"/>
+                <w:b w:val="false"/>
+                <w:bCs w:val="false"/>
+                <w:sz w:val="16"/>
+                <w:szCs w:val="16"/>
+              </w:rPr>
+              <w:t xml:space="preserve">Slack shelters starting about 30% behind is acceptable; the tier-1 confidence is a prompt-based AI judgment, accepted because it is informed by shelter and case facts</w:t>
+            </w:r>
+          </w:p>
+        </w:tc>
+        <w:tc>
+          <w:tcPr>
+            <w:tcW w:type="dxa" w:w="3500"/>
+            <w:tcMar>
+              <w:top w:type="dxa" w:w="45"/>
+              <w:left w:type="dxa" w:w="85"/>
+              <w:bottom w:type="dxa" w:w="45"/>
+              <w:right w:type="dxa" w:w="85"/>
+            </w:tcMar>
+          </w:tcPr>
+          <w:p>
+            <w:pPr>
+              <w:spacing w:after="20"/>
+            </w:pPr>
+            <w:r>
+              <w:rPr>
+                <w:rFonts w:ascii="Calibri" w:cs="Calibri" w:eastAsia="Calibri" w:hAnsi="Calibri"/>
+                <w:b w:val="false"/>
+                <w:bCs w:val="false"/>
+                <w:sz w:val="16"/>
+                <w:szCs w:val="16"/>
+              </w:rPr>
+              <w:t xml:space="preserve">Documented limitation; not calibrated against outcomes</w:t>
+            </w:r>
+          </w:p>
+        </w:tc>
+        <w:tc>
+          <w:tcPr>
+            <w:tcW w:type="dxa" w:w="2520"/>
+            <w:tcMar>
+              <w:top w:type="dxa" w:w="45"/>
+              <w:left w:type="dxa" w:w="85"/>
+              <w:bottom w:type="dxa" w:w="45"/>
+              <w:right w:type="dxa" w:w="85"/>
+            </w:tcMar>
+          </w:tcPr>
+          <w:p>
+            <w:pPr>
+              <w:spacing w:after="20"/>
+            </w:pPr>
+            <w:r>
+              <w:rPr>
+                <w:rFonts w:ascii="Calibri" w:cs="Calibri" w:eastAsia="Calibri" w:hAnsi="Calibri"/>
+                <w:b w:val="false"/>
+                <w:bCs w:val="false"/>
+                <w:sz w:val="16"/>
+                <w:szCs w:val="16"/>
+              </w:rPr>
+              <w:t xml:space="preserve">KI-20 to KI-24 and Section 5</w:t>
+            </w:r>
+          </w:p>
+        </w:tc>
+      </w:tr>
+      <w:tr>
+        <w:trPr>
+          <w:cantSplit/>
+          <w:tblHeader w:val="off"/>
+        </w:trPr>
+        <w:tc>
+          <w:tcPr>
+            <w:tcW w:type="dxa" w:w="3700"/>
+            <w:tcMar>
+              <w:top w:type="dxa" w:w="45"/>
+              <w:left w:type="dxa" w:w="85"/>
+              <w:bottom w:type="dxa" w:w="45"/>
+              <w:right w:type="dxa" w:w="85"/>
+            </w:tcMar>
+          </w:tcPr>
+          <w:p>
+            <w:pPr>
+              <w:spacing w:after="20"/>
+            </w:pPr>
+            <w:r>
+              <w:rPr>
+                <w:rFonts w:ascii="Calibri" w:cs="Calibri" w:eastAsia="Calibri" w:hAnsi="Calibri"/>
+                <w:b w:val="false"/>
+                <w:bCs w:val="false"/>
+                <w:sz w:val="16"/>
+                <w:szCs w:val="16"/>
+              </w:rPr>
+              <w:t xml:space="preserve">Alphabetical tie-break is fine for now; a real tie-breaker (distance or past responsiveness) is a future feature</w:t>
+            </w:r>
+          </w:p>
+        </w:tc>
+        <w:tc>
+          <w:tcPr>
+            <w:tcW w:type="dxa" w:w="3500"/>
+            <w:tcMar>
+              <w:top w:type="dxa" w:w="45"/>
+              <w:left w:type="dxa" w:w="85"/>
+              <w:bottom w:type="dxa" w:w="45"/>
+              <w:right w:type="dxa" w:w="85"/>
+            </w:tcMar>
+          </w:tcPr>
+          <w:p>
+            <w:pPr>
+              <w:spacing w:after="20"/>
+            </w:pPr>
+            <w:r>
+              <w:rPr>
+                <w:rFonts w:ascii="Calibri" w:cs="Calibri" w:eastAsia="Calibri" w:hAnsi="Calibri"/>
+                <w:b w:val="false"/>
+                <w:bCs w:val="false"/>
+                <w:sz w:val="16"/>
+                <w:szCs w:val="16"/>
+              </w:rPr>
+              <w:t xml:space="preserve">Both raw and tie-rule results continue to be reported</w:t>
+            </w:r>
+          </w:p>
+        </w:tc>
+        <w:tc>
+          <w:tcPr>
+            <w:tcW w:type="dxa" w:w="2520"/>
+            <w:tcMar>
+              <w:top w:type="dxa" w:w="45"/>
+              <w:left w:type="dxa" w:w="85"/>
+              <w:bottom w:type="dxa" w:w="45"/>
+              <w:right w:type="dxa" w:w="85"/>
+            </w:tcMar>
+          </w:tcPr>
+          <w:p>
+            <w:pPr>
+              <w:spacing w:after="20"/>
+            </w:pPr>
+            <w:r>
+              <w:rPr>
+                <w:rFonts w:ascii="Calibri" w:cs="Calibri" w:eastAsia="Calibri" w:hAnsi="Calibri"/>
+                <w:b w:val="false"/>
+                <w:bCs w:val="false"/>
+                <w:sz w:val="16"/>
+                <w:szCs w:val="16"/>
+              </w:rPr>
+              <w:t xml:space="preserve">Backlog</w:t>
+            </w:r>
+          </w:p>
+        </w:tc>
+      </w:tr>
+      <w:tr>
+        <w:trPr>
+          <w:cantSplit/>
+          <w:tblHeader w:val="off"/>
+        </w:trPr>
+        <w:tc>
+          <w:tcPr>
+            <w:tcW w:type="dxa" w:w="3700"/>
+            <w:tcMar>
+              <w:top w:type="dxa" w:w="45"/>
+              <w:left w:type="dxa" w:w="85"/>
+              <w:bottom w:type="dxa" w:w="45"/>
+              <w:right w:type="dxa" w:w="85"/>
+            </w:tcMar>
+          </w:tcPr>
+          <w:p>
+            <w:pPr>
+              <w:spacing w:after="20"/>
+            </w:pPr>
+            <w:r>
+              <w:rPr>
+                <w:rFonts w:ascii="Calibri" w:cs="Calibri" w:eastAsia="Calibri" w:hAnsi="Calibri"/>
+                <w:b w:val="false"/>
+                <w:bCs w:val="false"/>
+                <w:sz w:val="16"/>
+                <w:szCs w:val="16"/>
+              </w:rPr>
+              <w:t xml:space="preserve">Idea: temporary emergency shelters that can treat or hold an animal until a suitable shelter confirms</w:t>
+            </w:r>
+          </w:p>
+        </w:tc>
+        <w:tc>
+          <w:tcPr>
+            <w:tcW w:type="dxa" w:w="3500"/>
+            <w:tcMar>
+              <w:top w:type="dxa" w:w="45"/>
+              <w:left w:type="dxa" w:w="85"/>
+              <w:bottom w:type="dxa" w:w="45"/>
+              <w:right w:type="dxa" w:w="85"/>
+            </w:tcMar>
+          </w:tcPr>
+          <w:p>
+            <w:pPr>
+              <w:spacing w:after="20"/>
+            </w:pPr>
+            <w:r>
+              <w:rPr>
+                <w:rFonts w:ascii="Calibri" w:cs="Calibri" w:eastAsia="Calibri" w:hAnsi="Calibri"/>
+                <w:b w:val="false"/>
+                <w:bCs w:val="false"/>
+                <w:sz w:val="16"/>
+                <w:szCs w:val="16"/>
+              </w:rPr>
+              <w:t xml:space="preserve">Out of the current scope</w:t>
+            </w:r>
+          </w:p>
+        </w:tc>
+        <w:tc>
+          <w:tcPr>
+            <w:tcW w:type="dxa" w:w="2520"/>
+            <w:tcMar>
+              <w:top w:type="dxa" w:w="45"/>
+              <w:left w:type="dxa" w:w="85"/>
+              <w:bottom w:type="dxa" w:w="45"/>
+              <w:right w:type="dxa" w:w="85"/>
+            </w:tcMar>
+          </w:tcPr>
+          <w:p>
+            <w:pPr>
+              <w:spacing w:after="20"/>
+            </w:pPr>
+            <w:r>
+              <w:rPr>
+                <w:rFonts w:ascii="Calibri" w:cs="Calibri" w:eastAsia="Calibri" w:hAnsi="Calibri"/>
+                <w:b w:val="false"/>
+                <w:bCs w:val="false"/>
+                <w:sz w:val="16"/>
+                <w:szCs w:val="16"/>
+              </w:rPr>
+              <w:t xml:space="preserve">KI-24</w:t>
             </w:r>
           </w:p>
         </w:tc>
@@ -8210,7 +9702,7 @@
           <w:sz w:val="21"/>
           <w:szCs w:val="21"/>
         </w:rPr>
-        <w:t xml:space="preserve">Repository https://github.com/manojvprimary/rescuenet. The ablation code, pre-registration, results, and evidence file are on branch sprint-4/ablation and tag v0.4.0-ablation. Clean-clone evidence: docs/evidence/sprint-4/node20-ablation.txt, captured against commit 229a259; later commits add documentation only.</w:t>
+        <w:t xml:space="preserve">Repository https://github.com/manojvprimary/rescuenet. The ablation code, pre-registration, results, evidence file, and the verbatim review record are on branch sprint-4/ablation (final commit 206d6b2; tag v0.4.0-ablation marks the analysis commit). Clean-clone evidence: docs/evidence/sprint-4/node20-ablation.txt, captured against commit 229a259; later commits add documentation only.</w:t>
       </w:r>
     </w:p>
     <w:p>
@@ -21611,7 +23103,7 @@
                 <w:sz w:val="17"/>
                 <w:szCs w:val="17"/>
               </w:rPr>
-              <w:t xml:space="preserve">The student read the eight set-2 annotations and replied "approve all" (recorded in docs/evidence/sprint-4/annotation-approval.txt); no change was requested. The student was not told the number or cost of the 32 live Bedrock calls (about $0.20) before they were made; the AI ran them under the student's general "go" and reported them afterwards. The student had not yet done the code review in docs/STUDENT_REVIEW_GUIDE.md when this entry was written.</w:t>
+              <w:t xml:space="preserve">The student read the eight set-2 annotations and replied "approve all" (recorded in docs/evidence/sprint-4/annotation-approval.txt); no change was requested. The student was not told the number or cost of the 32 live Bedrock calls (about $0.20) before they were made; the AI ran them under the student's general "go" and reported them afterwards. The student then reviewed five highest-risk areas in a chat session, item by item, with replies recorded verbatim in docs/evidence/sprint-4/student-review-record.md: items 1 to 4 (scoring function, weight blend and fallback, classifier path, harness tie rule) were answered in detail and led to decisions and issues KI-23 and KI-24; item 5 (the ablation and five AHP judgments) was answered with a general approval only.</w:t>
             </w:r>
           </w:p>
         </w:tc>
@@ -22168,7 +23660,7 @@
                 <w:sz w:val="17"/>
                 <w:szCs w:val="17"/>
               </w:rPr>
-              <w:t xml:space="preserve">To be recorded by the student. Any edits made after this entry was written are not reflected here.</w:t>
+              <w:t xml:space="preserve">The student-review section contains the student's replies exactly as typed. The student set the decisions listed in Section 1.4 of the document. Any other edits the student makes after this entry was written are not reflected here.</w:t>
             </w:r>
           </w:p>
         </w:tc>

</xml_diff>

<commit_message>
Hard Stop 4: remove the walkthrough script and every reference to it
Co-Authored-By: Claude Sonnet 5.5 <noreply@anthropic.com>
</commit_message>
<xml_diff>
--- a/docs/CISC699_HardStop4_TechnicalEvidenceReview.docx
+++ b/docs/CISC699_HardStop4_TechnicalEvidenceReview.docx
@@ -171,7 +171,7 @@
                 <w:sz w:val="18"/>
                 <w:szCs w:val="18"/>
               </w:rPr>
-              <w:t xml:space="preserve">What is in this submission: this document; the recorded walkthrough (the student's own recording); the repository at the tag named in Section 8; and the clean-clone evidence file docs/evidence/sprint-4/node20-ablation.txt. The student-review record in Section 1.3 is the student's own writing.</w:t>
+              <w:t xml:space="preserve">What is in this submission: this document; the repository named in Section 8; and the clean-clone evidence file docs/evidence/sprint-4/node20-ablation.txt. The student-review record in Section 1.3 is the student's own writing.</w:t>
             </w:r>
           </w:p>
         </w:tc>
@@ -778,7 +778,7 @@
           <w:sz w:val="22"/>
           <w:szCs w:val="22"/>
         </w:rPr>
-        <w:t xml:space="preserve">Entry 25 — Hard Stop 4 Technical Evidence Review (This Document and the Walkthrough Script)</w:t>
+        <w:t xml:space="preserve">Entry 25 — Hard Stop 4 Technical Evidence Review (This Document)</w:t>
       </w:r>
     </w:p>
     <w:tbl>
@@ -1026,7 +1026,7 @@
                 <w:sz w:val="17"/>
                 <w:szCs w:val="17"/>
               </w:rPr>
-              <w:t xml:space="preserve">Assemble the evidence review and the recorded-walkthrough script from the repository's own files.</w:t>
+              <w:t xml:space="preserve">Assemble the evidence review from the repository's own files.</w:t>
             </w:r>
           </w:p>
         </w:tc>
@@ -1084,7 +1084,7 @@
                 <w:sz w:val="17"/>
                 <w:szCs w:val="17"/>
               </w:rPr>
-              <w:t xml:space="preserve">Generate the document, its figures and tables from the committed results (eval/results/ablation*.json, docs/evidence/sprint-4/, the measurement and midpoint files); write a 10-minute walkthrough script. Every number in the tables is read from a file by the generator. AI-generated text, tables, and figures.</w:t>
+              <w:t xml:space="preserve">Generate the document, its figures and tables from the committed results (eval/results/ablation*.json, docs/evidence/sprint-4/, the measurement and midpoint files). Every number in the tables is read from a file by the generator. AI-generated text, tables, and figures.</w:t>
             </w:r>
           </w:p>
         </w:tc>
@@ -1142,7 +1142,7 @@
                 <w:sz w:val="17"/>
                 <w:szCs w:val="17"/>
               </w:rPr>
-              <w:t xml:space="preserve">The submitted document and the script the student uses for the recording.</w:t>
+              <w:t xml:space="preserve">The submitted document.</w:t>
             </w:r>
           </w:p>
         </w:tc>
@@ -23122,7 +23122,7 @@
           <w:sz w:val="22"/>
           <w:szCs w:val="22"/>
         </w:rPr>
-        <w:t xml:space="preserve">Entry 25 — Hard Stop 4 Technical Evidence Review (This Document and the Walkthrough Script)</w:t>
+        <w:t xml:space="preserve">Entry 25 — Hard Stop 4 Technical Evidence Review (This Document)</w:t>
       </w:r>
     </w:p>
     <w:tbl>
@@ -23370,7 +23370,7 @@
                 <w:sz w:val="17"/>
                 <w:szCs w:val="17"/>
               </w:rPr>
-              <w:t xml:space="preserve">Assemble the evidence review and the recorded-walkthrough script from the repository's own files.</w:t>
+              <w:t xml:space="preserve">Assemble the evidence review from the repository's own files.</w:t>
             </w:r>
           </w:p>
         </w:tc>
@@ -23428,7 +23428,7 @@
                 <w:sz w:val="17"/>
                 <w:szCs w:val="17"/>
               </w:rPr>
-              <w:t xml:space="preserve">Generate the document, its figures and tables from the committed results (eval/results/ablation*.json, docs/evidence/sprint-4/, the measurement and midpoint files); write a 10-minute walkthrough script. Every number in the tables is read from a file by the generator. AI-generated text, tables, and figures.</w:t>
+              <w:t xml:space="preserve">Generate the document, its figures and tables from the committed results (eval/results/ablation*.json, docs/evidence/sprint-4/, the measurement and midpoint files). Every number in the tables is read from a file by the generator. AI-generated text, tables, and figures.</w:t>
             </w:r>
           </w:p>
         </w:tc>
@@ -23486,7 +23486,7 @@
                 <w:sz w:val="17"/>
                 <w:szCs w:val="17"/>
               </w:rPr>
-              <w:t xml:space="preserve">The submitted document and the script the student uses for the recording.</w:t>
+              <w:t xml:space="preserve">The submitted document.</w:t>
             </w:r>
           </w:p>
         </w:tc>

</xml_diff>